<commit_message>
docs(brd): make BRD standalone for customer delivery (EN + AR)
Remove every external-document reference so the BRD can be delivered on
its own: drop the section 6 references table (SRS/SAD/RPM/API/SES/VID/
UCS/RDR) in favour of a standalone note, and strip inline doc mentions
from the purpose, FR-106/1201/1206, NFR-01/05/09 and OP-11. Remove the
dangling D6/D7 decision codes (the OI-1/OI-2/G-OI-2/OI-4 open items stay,
defined in section 5.7). Drop the cover template note.

Humanise the narrative prose (active voice, plain copulas, no false
"attached documents" claim) while keeping the formal register and the
AI-capability content. Public standard citations (NCA, ECC, OWASP) kept.

Co-Authored-By: Claude Opus 4.8 (1M context) <noreply@anthropic.com>
</commit_message>
<xml_diff>
--- a/docs/SIMF-BRD-001-Business-Requirements-Document-EN.docx
+++ b/docs/SIMF-BRD-001-Business-Requirements-Document-EN.docx
@@ -11,7 +11,7 @@
           <w:noProof/>
         </w:rPr>
         <w:drawing>
-          <wp:inline distT="0" distB="0" distL="0" distR="0" wp14:anchorId="7419B50C" wp14:editId="1943840C">
+          <wp:inline distT="0" distB="0" distL="0" distR="0" wp14:anchorId="426F8554" wp14:editId="4B5AB943">
             <wp:extent cx="2592000" cy="946286"/>
             <wp:effectExtent l="0" t="0" r="0" b="0"/>
             <wp:docPr id="1" name="Picture 1"/>
@@ -45,20 +45,6 @@
             </a:graphic>
           </wp:inline>
         </w:drawing>
-      </w:r>
-    </w:p>
-    <w:p>
-      <w:pPr>
-        <w:spacing w:before="80" w:after="120"/>
-        <w:jc w:val="center"/>
-      </w:pPr>
-      <w:r>
-        <w:rPr>
-          <w:i/>
-          <w:color w:val="595959"/>
-          <w:sz w:val="20"/>
-        </w:rPr>
-        <w:t>[ This document is a completed Business Requirements Document template ]</w:t>
       </w:r>
     </w:p>
     <w:tbl>
@@ -1027,7 +1013,7 @@
       <w:r>
         <w:fldChar w:fldCharType="separate"/>
       </w:r>
-      <w:hyperlink w:anchor="_Toc235386354" w:history="1">
+      <w:hyperlink w:anchor="_Toc235461051" w:history="1">
         <w:r>
           <w:rPr>
             <w:rStyle w:val="Hyperlink"/>
@@ -1054,7 +1040,7 @@
             <w:noProof/>
             <w:webHidden/>
           </w:rPr>
-          <w:instrText xml:space="preserve"> PAGEREF _Toc235386354 \h </w:instrText>
+          <w:instrText xml:space="preserve"> PAGEREF _Toc235461051 \h </w:instrText>
         </w:r>
         <w:r>
           <w:rPr>
@@ -1099,7 +1085,7 @@
           <w14:ligatures w14:val="standardContextual"/>
         </w:rPr>
       </w:pPr>
-      <w:hyperlink w:anchor="_Toc235386355" w:history="1">
+      <w:hyperlink w:anchor="_Toc235461052" w:history="1">
         <w:r>
           <w:rPr>
             <w:rStyle w:val="Hyperlink"/>
@@ -1126,7 +1112,7 @@
             <w:noProof/>
             <w:webHidden/>
           </w:rPr>
-          <w:instrText xml:space="preserve"> PAGEREF _Toc235386355 \h </w:instrText>
+          <w:instrText xml:space="preserve"> PAGEREF _Toc235461052 \h </w:instrText>
         </w:r>
         <w:r>
           <w:rPr>
@@ -1171,7 +1157,7 @@
           <w14:ligatures w14:val="standardContextual"/>
         </w:rPr>
       </w:pPr>
-      <w:hyperlink w:anchor="_Toc235386356" w:history="1">
+      <w:hyperlink w:anchor="_Toc235461053" w:history="1">
         <w:r>
           <w:rPr>
             <w:rStyle w:val="Hyperlink"/>
@@ -1198,7 +1184,7 @@
             <w:noProof/>
             <w:webHidden/>
           </w:rPr>
-          <w:instrText xml:space="preserve"> PAGEREF _Toc235386356 \h </w:instrText>
+          <w:instrText xml:space="preserve"> PAGEREF _Toc235461053 \h </w:instrText>
         </w:r>
         <w:r>
           <w:rPr>
@@ -1243,7 +1229,7 @@
           <w14:ligatures w14:val="standardContextual"/>
         </w:rPr>
       </w:pPr>
-      <w:hyperlink w:anchor="_Toc235386357" w:history="1">
+      <w:hyperlink w:anchor="_Toc235461054" w:history="1">
         <w:r>
           <w:rPr>
             <w:rStyle w:val="Hyperlink"/>
@@ -1270,7 +1256,7 @@
             <w:noProof/>
             <w:webHidden/>
           </w:rPr>
-          <w:instrText xml:space="preserve"> PAGEREF _Toc235386357 \h </w:instrText>
+          <w:instrText xml:space="preserve"> PAGEREF _Toc235461054 \h </w:instrText>
         </w:r>
         <w:r>
           <w:rPr>
@@ -1315,7 +1301,7 @@
           <w14:ligatures w14:val="standardContextual"/>
         </w:rPr>
       </w:pPr>
-      <w:hyperlink w:anchor="_Toc235386358" w:history="1">
+      <w:hyperlink w:anchor="_Toc235461055" w:history="1">
         <w:r>
           <w:rPr>
             <w:rStyle w:val="Hyperlink"/>
@@ -1342,7 +1328,7 @@
             <w:noProof/>
             <w:webHidden/>
           </w:rPr>
-          <w:instrText xml:space="preserve"> PAGEREF _Toc235386358 \h </w:instrText>
+          <w:instrText xml:space="preserve"> PAGEREF _Toc235461055 \h </w:instrText>
         </w:r>
         <w:r>
           <w:rPr>
@@ -1387,7 +1373,7 @@
           <w14:ligatures w14:val="standardContextual"/>
         </w:rPr>
       </w:pPr>
-      <w:hyperlink w:anchor="_Toc235386359" w:history="1">
+      <w:hyperlink w:anchor="_Toc235461056" w:history="1">
         <w:r>
           <w:rPr>
             <w:rStyle w:val="Hyperlink"/>
@@ -1414,7 +1400,7 @@
             <w:noProof/>
             <w:webHidden/>
           </w:rPr>
-          <w:instrText xml:space="preserve"> PAGEREF _Toc235386359 \h </w:instrText>
+          <w:instrText xml:space="preserve"> PAGEREF _Toc235461056 \h </w:instrText>
         </w:r>
         <w:r>
           <w:rPr>
@@ -1459,7 +1445,7 @@
           <w14:ligatures w14:val="standardContextual"/>
         </w:rPr>
       </w:pPr>
-      <w:hyperlink w:anchor="_Toc235386360" w:history="1">
+      <w:hyperlink w:anchor="_Toc235461057" w:history="1">
         <w:r>
           <w:rPr>
             <w:rStyle w:val="Hyperlink"/>
@@ -1486,7 +1472,7 @@
             <w:noProof/>
             <w:webHidden/>
           </w:rPr>
-          <w:instrText xml:space="preserve"> PAGEREF _Toc235386360 \h </w:instrText>
+          <w:instrText xml:space="preserve"> PAGEREF _Toc235461057 \h </w:instrText>
         </w:r>
         <w:r>
           <w:rPr>
@@ -1531,7 +1517,7 @@
           <w14:ligatures w14:val="standardContextual"/>
         </w:rPr>
       </w:pPr>
-      <w:hyperlink w:anchor="_Toc235386361" w:history="1">
+      <w:hyperlink w:anchor="_Toc235461058" w:history="1">
         <w:r>
           <w:rPr>
             <w:rStyle w:val="Hyperlink"/>
@@ -1558,7 +1544,7 @@
             <w:noProof/>
             <w:webHidden/>
           </w:rPr>
-          <w:instrText xml:space="preserve"> PAGEREF _Toc235386361 \h </w:instrText>
+          <w:instrText xml:space="preserve"> PAGEREF _Toc235461058 \h </w:instrText>
         </w:r>
         <w:r>
           <w:rPr>
@@ -1603,7 +1589,7 @@
           <w14:ligatures w14:val="standardContextual"/>
         </w:rPr>
       </w:pPr>
-      <w:hyperlink w:anchor="_Toc235386362" w:history="1">
+      <w:hyperlink w:anchor="_Toc235461059" w:history="1">
         <w:r>
           <w:rPr>
             <w:rStyle w:val="Hyperlink"/>
@@ -1630,7 +1616,7 @@
             <w:noProof/>
             <w:webHidden/>
           </w:rPr>
-          <w:instrText xml:space="preserve"> PAGEREF _Toc235386362 \h </w:instrText>
+          <w:instrText xml:space="preserve"> PAGEREF _Toc235461059 \h </w:instrText>
         </w:r>
         <w:r>
           <w:rPr>
@@ -1675,7 +1661,7 @@
           <w14:ligatures w14:val="standardContextual"/>
         </w:rPr>
       </w:pPr>
-      <w:hyperlink w:anchor="_Toc235386363" w:history="1">
+      <w:hyperlink w:anchor="_Toc235461060" w:history="1">
         <w:r>
           <w:rPr>
             <w:rStyle w:val="Hyperlink"/>
@@ -1702,7 +1688,7 @@
             <w:noProof/>
             <w:webHidden/>
           </w:rPr>
-          <w:instrText xml:space="preserve"> PAGEREF _Toc235386363 \h </w:instrText>
+          <w:instrText xml:space="preserve"> PAGEREF _Toc235461060 \h </w:instrText>
         </w:r>
         <w:r>
           <w:rPr>
@@ -1747,7 +1733,7 @@
           <w14:ligatures w14:val="standardContextual"/>
         </w:rPr>
       </w:pPr>
-      <w:hyperlink w:anchor="_Toc235386364" w:history="1">
+      <w:hyperlink w:anchor="_Toc235461061" w:history="1">
         <w:r>
           <w:rPr>
             <w:rStyle w:val="Hyperlink"/>
@@ -1774,7 +1760,7 @@
             <w:noProof/>
             <w:webHidden/>
           </w:rPr>
-          <w:instrText xml:space="preserve"> PAGEREF _Toc235386364 \h </w:instrText>
+          <w:instrText xml:space="preserve"> PAGEREF _Toc235461061 \h </w:instrText>
         </w:r>
         <w:r>
           <w:rPr>
@@ -1819,7 +1805,7 @@
           <w14:ligatures w14:val="standardContextual"/>
         </w:rPr>
       </w:pPr>
-      <w:hyperlink w:anchor="_Toc235386365" w:history="1">
+      <w:hyperlink w:anchor="_Toc235461062" w:history="1">
         <w:r>
           <w:rPr>
             <w:rStyle w:val="Hyperlink"/>
@@ -1846,7 +1832,7 @@
             <w:noProof/>
             <w:webHidden/>
           </w:rPr>
-          <w:instrText xml:space="preserve"> PAGEREF _Toc235386365 \h </w:instrText>
+          <w:instrText xml:space="preserve"> PAGEREF _Toc235461062 \h </w:instrText>
         </w:r>
         <w:r>
           <w:rPr>
@@ -1891,7 +1877,7 @@
           <w14:ligatures w14:val="standardContextual"/>
         </w:rPr>
       </w:pPr>
-      <w:hyperlink w:anchor="_Toc235386366" w:history="1">
+      <w:hyperlink w:anchor="_Toc235461063" w:history="1">
         <w:r>
           <w:rPr>
             <w:rStyle w:val="Hyperlink"/>
@@ -1918,7 +1904,7 @@
             <w:noProof/>
             <w:webHidden/>
           </w:rPr>
-          <w:instrText xml:space="preserve"> PAGEREF _Toc235386366 \h </w:instrText>
+          <w:instrText xml:space="preserve"> PAGEREF _Toc235461063 \h </w:instrText>
         </w:r>
         <w:r>
           <w:rPr>
@@ -1963,7 +1949,7 @@
           <w14:ligatures w14:val="standardContextual"/>
         </w:rPr>
       </w:pPr>
-      <w:hyperlink w:anchor="_Toc235386367" w:history="1">
+      <w:hyperlink w:anchor="_Toc235461064" w:history="1">
         <w:r>
           <w:rPr>
             <w:rStyle w:val="Hyperlink"/>
@@ -1990,7 +1976,7 @@
             <w:noProof/>
             <w:webHidden/>
           </w:rPr>
-          <w:instrText xml:space="preserve"> PAGEREF _Toc235386367 \h </w:instrText>
+          <w:instrText xml:space="preserve"> PAGEREF _Toc235461064 \h </w:instrText>
         </w:r>
         <w:r>
           <w:rPr>
@@ -2035,7 +2021,7 @@
           <w14:ligatures w14:val="standardContextual"/>
         </w:rPr>
       </w:pPr>
-      <w:hyperlink w:anchor="_Toc235386368" w:history="1">
+      <w:hyperlink w:anchor="_Toc235461065" w:history="1">
         <w:r>
           <w:rPr>
             <w:rStyle w:val="Hyperlink"/>
@@ -2062,7 +2048,7 @@
             <w:noProof/>
             <w:webHidden/>
           </w:rPr>
-          <w:instrText xml:space="preserve"> PAGEREF _Toc235386368 \h </w:instrText>
+          <w:instrText xml:space="preserve"> PAGEREF _Toc235461065 \h </w:instrText>
         </w:r>
         <w:r>
           <w:rPr>
@@ -2107,7 +2093,7 @@
           <w14:ligatures w14:val="standardContextual"/>
         </w:rPr>
       </w:pPr>
-      <w:hyperlink w:anchor="_Toc235386369" w:history="1">
+      <w:hyperlink w:anchor="_Toc235461066" w:history="1">
         <w:r>
           <w:rPr>
             <w:rStyle w:val="Hyperlink"/>
@@ -2134,7 +2120,7 @@
             <w:noProof/>
             <w:webHidden/>
           </w:rPr>
-          <w:instrText xml:space="preserve"> PAGEREF _Toc235386369 \h </w:instrText>
+          <w:instrText xml:space="preserve"> PAGEREF _Toc235461066 \h </w:instrText>
         </w:r>
         <w:r>
           <w:rPr>
@@ -2179,7 +2165,7 @@
           <w14:ligatures w14:val="standardContextual"/>
         </w:rPr>
       </w:pPr>
-      <w:hyperlink w:anchor="_Toc235386370" w:history="1">
+      <w:hyperlink w:anchor="_Toc235461067" w:history="1">
         <w:r>
           <w:rPr>
             <w:rStyle w:val="Hyperlink"/>
@@ -2206,7 +2192,7 @@
             <w:noProof/>
             <w:webHidden/>
           </w:rPr>
-          <w:instrText xml:space="preserve"> PAGEREF _Toc235386370 \h </w:instrText>
+          <w:instrText xml:space="preserve"> PAGEREF _Toc235461067 \h </w:instrText>
         </w:r>
         <w:r>
           <w:rPr>
@@ -2251,7 +2237,7 @@
           <w14:ligatures w14:val="standardContextual"/>
         </w:rPr>
       </w:pPr>
-      <w:hyperlink w:anchor="_Toc235386371" w:history="1">
+      <w:hyperlink w:anchor="_Toc235461068" w:history="1">
         <w:r>
           <w:rPr>
             <w:rStyle w:val="Hyperlink"/>
@@ -2278,7 +2264,7 @@
             <w:noProof/>
             <w:webHidden/>
           </w:rPr>
-          <w:instrText xml:space="preserve"> PAGEREF _Toc235386371 \h </w:instrText>
+          <w:instrText xml:space="preserve"> PAGEREF _Toc235461068 \h </w:instrText>
         </w:r>
         <w:r>
           <w:rPr>
@@ -2323,7 +2309,7 @@
           <w14:ligatures w14:val="standardContextual"/>
         </w:rPr>
       </w:pPr>
-      <w:hyperlink w:anchor="_Toc235386372" w:history="1">
+      <w:hyperlink w:anchor="_Toc235461069" w:history="1">
         <w:r>
           <w:rPr>
             <w:rStyle w:val="Hyperlink"/>
@@ -2350,7 +2336,7 @@
             <w:noProof/>
             <w:webHidden/>
           </w:rPr>
-          <w:instrText xml:space="preserve"> PAGEREF _Toc235386372 \h </w:instrText>
+          <w:instrText xml:space="preserve"> PAGEREF _Toc235461069 \h </w:instrText>
         </w:r>
         <w:r>
           <w:rPr>
@@ -2395,7 +2381,7 @@
           <w14:ligatures w14:val="standardContextual"/>
         </w:rPr>
       </w:pPr>
-      <w:hyperlink w:anchor="_Toc235386373" w:history="1">
+      <w:hyperlink w:anchor="_Toc235461070" w:history="1">
         <w:r>
           <w:rPr>
             <w:rStyle w:val="Hyperlink"/>
@@ -2422,7 +2408,7 @@
             <w:noProof/>
             <w:webHidden/>
           </w:rPr>
-          <w:instrText xml:space="preserve"> PAGEREF _Toc235386373 \h </w:instrText>
+          <w:instrText xml:space="preserve"> PAGEREF _Toc235461070 \h </w:instrText>
         </w:r>
         <w:r>
           <w:rPr>
@@ -2467,7 +2453,7 @@
           <w14:ligatures w14:val="standardContextual"/>
         </w:rPr>
       </w:pPr>
-      <w:hyperlink w:anchor="_Toc235386374" w:history="1">
+      <w:hyperlink w:anchor="_Toc235461071" w:history="1">
         <w:r>
           <w:rPr>
             <w:rStyle w:val="Hyperlink"/>
@@ -2494,7 +2480,7 @@
             <w:noProof/>
             <w:webHidden/>
           </w:rPr>
-          <w:instrText xml:space="preserve"> PAGEREF _Toc235386374 \h </w:instrText>
+          <w:instrText xml:space="preserve"> PAGEREF _Toc235461071 \h </w:instrText>
         </w:r>
         <w:r>
           <w:rPr>
@@ -3631,7 +3617,7 @@
         <w:pStyle w:val="Heading1"/>
         <w:spacing w:before="240" w:after="120"/>
       </w:pPr>
-      <w:bookmarkStart w:id="0" w:name="_Toc235386354"/>
+      <w:bookmarkStart w:id="0" w:name="_Toc235461051"/>
       <w:r>
         <w:rPr>
           <w:rFonts w:ascii="Arial" w:hAnsi="Arial"/>
@@ -3647,7 +3633,7 @@
         <w:pStyle w:val="Heading2"/>
         <w:spacing w:before="160" w:after="120"/>
       </w:pPr>
-      <w:bookmarkStart w:id="1" w:name="_Toc235386355"/>
+      <w:bookmarkStart w:id="1" w:name="_Toc235461052"/>
       <w:r>
         <w:rPr>
           <w:rFonts w:ascii="Arial" w:hAnsi="Arial"/>
@@ -3662,7 +3648,7 @@
         <w:spacing w:after="120"/>
       </w:pPr>
       <w:r>
-        <w:t>This document describes the business requirements for the Saudi International Maritime Forum (SIMF 2026) system: an integrated platform that runs the full lifecycle of the forum and exhibition, including registration and security vetting, badge issue and access control, the scientific programme and live engagement, networking between attendees, media and news, and statistics.</w:t>
+        <w:t>This document sets out the business requirements for the Saudi International Maritime Forum (SIMF 2026) system, an integrated platform that runs the forum and exhibition: registration and security vetting, badge issue and access control, the scientific programme, live engagement, networking between attendees, media and news, and statistics.</w:t>
       </w:r>
     </w:p>
     <w:p>
@@ -3670,7 +3656,7 @@
         <w:spacing w:after="120"/>
       </w:pPr>
       <w:r>
-        <w:t>The purpose of the document is to define the objectives and scope of the solution and to describe the requirements agreed with the owner, so it serves as an approved reference for the analysis, design, development, testing and quality-assurance teams, and every requirement can be traced into design, code and tests through a stable identifier. This document sits at the business level, one level above the detailed Software Requirements Specification (SIMF-SRS-001) and the per-feature design specifications.</w:t>
+        <w:t>It defines the objectives and scope of the solution and records the requirements agreed with the owner, so the analysis, design, development and testing teams work from a single approved reference and each requirement can be traced into design, code and tests through a stable identifier. It is written at the business level, above the detailed software requirements and the per-feature design work.</w:t>
       </w:r>
     </w:p>
     <w:p>
@@ -3678,7 +3664,7 @@
         <w:pStyle w:val="Heading2"/>
         <w:spacing w:before="160" w:after="120"/>
       </w:pPr>
-      <w:bookmarkStart w:id="2" w:name="_Toc235386356"/>
+      <w:bookmarkStart w:id="2" w:name="_Toc235461053"/>
       <w:r>
         <w:rPr>
           <w:rFonts w:ascii="Arial" w:hAnsi="Arial"/>
@@ -4041,7 +4027,7 @@
         <w:pStyle w:val="Heading1"/>
         <w:spacing w:before="240" w:after="120"/>
       </w:pPr>
-      <w:bookmarkStart w:id="3" w:name="_Toc235386357"/>
+      <w:bookmarkStart w:id="3" w:name="_Toc235461054"/>
       <w:r>
         <w:rPr>
           <w:rFonts w:ascii="Arial" w:hAnsi="Arial"/>
@@ -4057,7 +4043,7 @@
         <w:pStyle w:val="Heading2"/>
         <w:spacing w:before="160" w:after="120"/>
       </w:pPr>
-      <w:bookmarkStart w:id="4" w:name="_Toc235386358"/>
+      <w:bookmarkStart w:id="4" w:name="_Toc235461055"/>
       <w:r>
         <w:rPr>
           <w:rFonts w:ascii="Arial" w:hAnsi="Arial"/>
@@ -4072,10 +4058,10 @@
         <w:spacing w:after="120"/>
       </w:pPr>
       <w:r>
-        <w:t>The Saudi International Maritime Forum is a recurring event, and this is its fourth edition. Each previous edition has been served by its own separately built systems, website and app, produced from scratch for that edition and then set aside. Rebuilding every time is costly and slow, scatters each edition's data in a different place, leaves no single reusable platform and no consolidated record across editions, and forces the cybersecurity controls, the technology choices and any intelligent features to be</w:t>
+        <w:t>The Saudi International Maritime Forum is a recurring event, and this is its fourth edition. Each previous edition ran on its own separately built systems, website and app, produced from scratch for that edition and then set aside. Rebuilding every time is costly and slow, scatters each edition's data in a different place, leaves no single reusable platform and no consolidated record across editions, and forces the cybersecurity controls, the technology choices and any intelligent features to be re-solved f</w:t>
       </w:r>
       <w:r>
-        <w:t xml:space="preserve"> re-solved from the ground up each time. What is needed is one dynamic, configurable system and app, built on modern technology, embedding AI and emerging technologies, and compliant with the National Cybersecurity Authority (NCA) standards, that can serve the current edition and every future edition without being rebuilt, with all editions' data held in one central location. Requirements analysis relies mainly on the attached documents and a set of interviews with the owner's representatives.</w:t>
+        <w:t>rom the ground up each time. What is needed is one dynamic, configurable system and app, built on modern technology, embedding AI and emerging technologies, and compliant with the National Cybersecurity Authority (NCA) standards, that can serve the current edition and every future edition without being rebuilt, with all editions' data held in one central location. The requirements in this document are based on the material provided by the owner and a series of interviews with the owner's representatives.</w:t>
       </w:r>
     </w:p>
     <w:p>
@@ -4083,7 +4069,7 @@
         <w:pStyle w:val="Heading2"/>
         <w:spacing w:before="160" w:after="120"/>
       </w:pPr>
-      <w:bookmarkStart w:id="5" w:name="_Toc235386359"/>
+      <w:bookmarkStart w:id="5" w:name="_Toc235461056"/>
       <w:r>
         <w:rPr>
           <w:rFonts w:ascii="Arial" w:hAnsi="Arial"/>
@@ -4109,7 +4095,7 @@
         <w:pStyle w:val="Heading2"/>
         <w:spacing w:before="160" w:after="120"/>
       </w:pPr>
-      <w:bookmarkStart w:id="6" w:name="_Toc235386360"/>
+      <w:bookmarkStart w:id="6" w:name="_Toc235461057"/>
       <w:r>
         <w:rPr>
           <w:rFonts w:ascii="Arial" w:hAnsi="Arial"/>
@@ -4127,10 +4113,10 @@
         <w:t>Design one dynamic, reusable platform, a single backend and unified API serving the administrative Control Panel, the public website and the attendee mobile app, that can run any edition of the forum without code changes. Everything that varies between editions is configured from the Control Panel: the event name, the colours, the logos and visual identity, the content and data, the categories, the start and end dates, and the archiving of past editions. All editions' data is held in one central location, s</w:t>
       </w:r>
       <w:r>
-        <w:t>o the same system is valid for the current edition and every future exhibition. The platform is built on a modern technology stack (see the Constraints), embeds AI and emerging technologies (a cognitive assistant and knowledge base, AI-generated session summaries, AI comment moderation, AI live translation and accessibility, and smart attendee and session recommendations), and is engineered to comply with the National Cybersecurity Authority (NCA) standards. On this dynamic base the platform covers the full</w:t>
+        <w:t>o the same system is valid for the current edition and every future exhibition. The platform is built on a modern technology stack, embeds AI and emerging technologies (a cognitive assistant and knowledge base, AI-generated session summaries, AI comment moderation, AI live translation and accessibility, and smart attendee and session recommendations), and is engineered to comply with the National Cybersecurity Authority (NCA) standards. On this dynamic base the platform covers the full event lifecycle: regi</w:t>
       </w:r>
       <w:r>
-        <w:t xml:space="preserve"> event lifecycle: registration, security vetting and approval, badge issue and access control, the programme, sessions and bookings, live streaming and engagement, networking between attendees, the exhibition and sponsors, media and news and archive, notifications and statistics, running on-premises as a single tenant.</w:t>
+        <w:t>stration, security vetting and approval, badge issue and access control, the programme, sessions and bookings, live streaming and engagement, networking between attendees, the exhibition and sponsors, media and news and archive, notifications and statistics, running on-premises as a single tenant.</w:t>
       </w:r>
     </w:p>
     <w:p>
@@ -4138,7 +4124,7 @@
         <w:pStyle w:val="Heading3"/>
         <w:spacing w:before="160" w:after="120"/>
       </w:pPr>
-      <w:bookmarkStart w:id="7" w:name="_Toc235386361"/>
+      <w:bookmarkStart w:id="7" w:name="_Toc235461058"/>
       <w:r>
         <w:rPr>
           <w:rFonts w:ascii="Arial" w:hAnsi="Arial"/>
@@ -4261,7 +4247,7 @@
         <w:pStyle w:val="Heading3"/>
         <w:spacing w:before="160" w:after="120"/>
       </w:pPr>
-      <w:bookmarkStart w:id="8" w:name="_Toc235386362"/>
+      <w:bookmarkStart w:id="8" w:name="_Toc235461059"/>
       <w:r>
         <w:rPr>
           <w:rFonts w:ascii="Arial" w:hAnsi="Arial"/>
@@ -4384,7 +4370,7 @@
         <w:pStyle w:val="Heading3"/>
         <w:spacing w:before="160" w:after="120"/>
       </w:pPr>
-      <w:bookmarkStart w:id="9" w:name="_Toc235386363"/>
+      <w:bookmarkStart w:id="9" w:name="_Toc235461060"/>
       <w:r>
         <w:rPr>
           <w:rFonts w:ascii="Arial" w:hAnsi="Arial"/>
@@ -4403,7 +4389,7 @@
         <w:rPr>
           <w:sz w:val="23"/>
         </w:rPr>
-        <w:t>Procuring the cognitive-AI provider, the live-broadcast platform and the WhatsApp provider; these are reached through abstractions and the provider is set later (decision D7).</w:t>
+        <w:t>Procuring the cognitive-AI provider, the live-broadcast platform and the WhatsApp provider; these are reached through abstractions and the provider is chosen later.</w:t>
       </w:r>
     </w:p>
     <w:p>
@@ -4415,7 +4401,7 @@
         <w:rPr>
           <w:sz w:val="23"/>
         </w:rPr>
-        <w:t>Authoring the legal text (Terms and Conditions and Policies); it is supplied by the owner (decision D6).</w:t>
+        <w:t>Authoring the legal text (Terms and Conditions and Policies); it is supplied by the owner.</w:t>
       </w:r>
     </w:p>
     <w:p>
@@ -4459,7 +4445,7 @@
         <w:pStyle w:val="Heading1"/>
         <w:spacing w:before="240" w:after="120"/>
       </w:pPr>
-      <w:bookmarkStart w:id="10" w:name="_Toc235386364"/>
+      <w:bookmarkStart w:id="10" w:name="_Toc235461061"/>
       <w:r>
         <w:rPr>
           <w:rFonts w:ascii="Arial" w:hAnsi="Arial"/>
@@ -4572,7 +4558,7 @@
         <w:pStyle w:val="Heading1"/>
         <w:spacing w:before="240" w:after="120"/>
       </w:pPr>
-      <w:bookmarkStart w:id="11" w:name="_Toc235386365"/>
+      <w:bookmarkStart w:id="11" w:name="_Toc235461062"/>
       <w:r>
         <w:rPr>
           <w:rFonts w:ascii="Arial" w:hAnsi="Arial"/>
@@ -5116,7 +5102,7 @@
         <w:pStyle w:val="Heading1"/>
         <w:spacing w:before="240" w:after="120"/>
       </w:pPr>
-      <w:bookmarkStart w:id="12" w:name="_Toc235386366"/>
+      <w:bookmarkStart w:id="12" w:name="_Toc235461063"/>
       <w:r>
         <w:rPr>
           <w:rFonts w:ascii="Arial" w:hAnsi="Arial"/>
@@ -5132,7 +5118,7 @@
         <w:pStyle w:val="Heading2"/>
         <w:spacing w:before="160" w:after="120"/>
       </w:pPr>
-      <w:bookmarkStart w:id="13" w:name="_Toc235386367"/>
+      <w:bookmarkStart w:id="13" w:name="_Toc235461064"/>
       <w:r>
         <w:rPr>
           <w:rFonts w:ascii="Arial" w:hAnsi="Arial"/>
@@ -5737,7 +5723,7 @@
         <w:pStyle w:val="Heading2"/>
         <w:spacing w:before="160" w:after="120"/>
       </w:pPr>
-      <w:bookmarkStart w:id="14" w:name="_Toc235386368"/>
+      <w:bookmarkStart w:id="14" w:name="_Toc235461065"/>
       <w:r>
         <w:rPr>
           <w:rFonts w:ascii="Arial" w:hAnsi="Arial"/>
@@ -6197,7 +6183,7 @@
               <w:rPr>
                 <w:sz w:val="19"/>
               </w:rPr>
-              <w:t>The system shall issue a short-lived access token and a rotating refresh token on sign-in, per SIMF-API-001.</w:t>
+              <w:t>The system shall issue a short-lived access token and a rotating refresh token on sign-in.</w:t>
             </w:r>
           </w:p>
         </w:tc>
@@ -10132,7 +10118,7 @@
               <w:rPr>
                 <w:sz w:val="19"/>
               </w:rPr>
-              <w:t>The exact field set of media and news items shall be confirmed per decision D6 (open item OI-1).</w:t>
+              <w:t>The exact field set of media and news items is an open item to be confirmed with the owner (OI-1).</w:t>
             </w:r>
           </w:p>
         </w:tc>
@@ -10369,7 +10355,7 @@
               <w:rPr>
                 <w:sz w:val="19"/>
               </w:rPr>
-              <w:t>The exact statistics list and the dashboards shall be confirmed per decision D6 (open item OI-1).</w:t>
+              <w:t>The exact statistics list and the dashboards are an open item to be confirmed with the owner (OI-1).</w:t>
             </w:r>
           </w:p>
         </w:tc>
@@ -10447,7 +10433,7 @@
               <w:rPr>
                 <w:sz w:val="19"/>
               </w:rPr>
-              <w:t>The system shall run the Control Panel on roles and permissions per SIMF-RPM-001; each user shall see only what their role permits.</w:t>
+              <w:t>The system shall run the Control Panel on roles and permissions; each user shall see only what their role permits.</w:t>
             </w:r>
           </w:p>
         </w:tc>
@@ -10712,7 +10698,7 @@
               <w:rPr>
                 <w:sz w:val="19"/>
               </w:rPr>
-              <w:t>The system shall apply the visual identity in SIMF-VID-001 across the Control Panel, the website and the app.</w:t>
+              <w:t>The system shall apply the approved visual identity across the Control Panel, the website and the app.</w:t>
             </w:r>
           </w:p>
         </w:tc>
@@ -10776,7 +10762,7 @@
         <w:pStyle w:val="Heading2"/>
         <w:spacing w:before="160" w:after="120"/>
       </w:pPr>
-      <w:bookmarkStart w:id="15" w:name="_Toc235386369"/>
+      <w:bookmarkStart w:id="15" w:name="_Toc235461066"/>
       <w:r>
         <w:rPr>
           <w:rFonts w:ascii="Arial" w:hAnsi="Arial"/>
@@ -11255,7 +11241,7 @@
               <w:rPr>
                 <w:sz w:val="21"/>
               </w:rPr>
-              <w:t>The system shall expose its functions only through the versioned API (SIMF-API-001); the website, Control Panel and app are its only clients.</w:t>
+              <w:t>The system shall expose its functions only through the versioned API; the website, Control Panel and app are its only clients.</w:t>
             </w:r>
           </w:p>
         </w:tc>
@@ -11266,7 +11252,7 @@
         <w:pStyle w:val="Heading2"/>
         <w:spacing w:before="160" w:after="120"/>
       </w:pPr>
-      <w:bookmarkStart w:id="16" w:name="_Toc235386370"/>
+      <w:bookmarkStart w:id="16" w:name="_Toc235461067"/>
       <w:r>
         <w:rPr>
           <w:rFonts w:ascii="Arial" w:hAnsi="Arial"/>
@@ -11365,7 +11351,7 @@
               <w:rPr>
                 <w:sz w:val="21"/>
               </w:rPr>
-              <w:t>Security. The system shall meet the NCA Secure Application Development Standard and the controls it references (ECC-1:2018, CSCC-1:2019, the OWASP Top 10 and OWASP ASVS). Defence-in-depth is specified in SIMF-SAD-001 section 8 and SIMF-SES-001 section 12.</w:t>
+              <w:t>Security. The system shall meet the NCA Secure Application Development Standard and the controls it references (ECC-1:2018, CSCC-1:2019, the OWASP Top 10 and OWASP ASVS), and shall apply defence-in-depth across every layer.</w:t>
             </w:r>
           </w:p>
         </w:tc>
@@ -11517,7 +11503,7 @@
               <w:rPr>
                 <w:sz w:val="21"/>
               </w:rPr>
-              <w:t>Availability. The system shall stay available through the three forum days, with health checks, a reverse proxy, and a retained last known-good build for rollback (SIMF-SAD-001 section 10).</w:t>
+              <w:t>Availability. The system shall stay available through the three forum days, with health checks, a reverse proxy, and a retained last known-good build for rollback.</w:t>
             </w:r>
           </w:p>
         </w:tc>
@@ -11669,7 +11655,7 @@
               <w:rPr>
                 <w:sz w:val="21"/>
               </w:rPr>
-              <w:t>Maintainability. The system shall follow SIMF-SES-001 (DDD layering, zero-warning builds, tests per change, no duplication).</w:t>
+              <w:t>Maintainability. The system shall follow the engineering standards: layered domain-driven design, zero-warning builds, tests with every change, and no duplicated code.</w:t>
             </w:r>
           </w:p>
         </w:tc>
@@ -11756,7 +11742,7 @@
         <w:pStyle w:val="Heading2"/>
         <w:spacing w:before="160" w:after="120"/>
       </w:pPr>
-      <w:bookmarkStart w:id="17" w:name="_Toc235386371"/>
+      <w:bookmarkStart w:id="17" w:name="_Toc235461068"/>
       <w:r>
         <w:rPr>
           <w:rFonts w:ascii="Arial" w:hAnsi="Arial"/>
@@ -11855,7 +11841,7 @@
         <w:pStyle w:val="Heading2"/>
         <w:spacing w:before="160" w:after="120"/>
       </w:pPr>
-      <w:bookmarkStart w:id="18" w:name="_Toc235386372"/>
+      <w:bookmarkStart w:id="18" w:name="_Toc235461069"/>
       <w:r>
         <w:rPr>
           <w:rFonts w:ascii="Arial" w:hAnsi="Arial"/>
@@ -11886,7 +11872,7 @@
         <w:rPr>
           <w:sz w:val="23"/>
         </w:rPr>
-        <w:t>The cognitive-AI provider, the live-broadcast platform and the WhatsApp provider are deferred and reached through abstractions (decision D7).</w:t>
+        <w:t>The cognitive-AI provider, the live-broadcast platform and the WhatsApp provider are deferred and reached through abstractions.</w:t>
       </w:r>
     </w:p>
     <w:p>
@@ -11898,7 +11884,7 @@
         <w:rPr>
           <w:sz w:val="23"/>
         </w:rPr>
-        <w:t>The legal text for the Terms and Conditions and the Policies is supplied by the client (decision D6).</w:t>
+        <w:t>The legal text for the Terms and Conditions and the Policies is supplied by the client.</w:t>
       </w:r>
     </w:p>
     <w:p>
@@ -11910,7 +11896,7 @@
         <w:rPr>
           <w:sz w:val="23"/>
         </w:rPr>
-        <w:t>The exact statistics list and the media and news field sets are fixed when decision D6 closes (open item OI-1).</w:t>
+        <w:t>The exact statistics list and the media and news field sets are fixed once the owner confirms them (open item OI-1).</w:t>
       </w:r>
     </w:p>
     <w:p>
@@ -11918,7 +11904,7 @@
         <w:pStyle w:val="Heading2"/>
         <w:spacing w:before="160" w:after="120"/>
       </w:pPr>
-      <w:bookmarkStart w:id="19" w:name="_Toc235386373"/>
+      <w:bookmarkStart w:id="19" w:name="_Toc235461070"/>
       <w:r>
         <w:rPr>
           <w:rFonts w:ascii="Arial" w:hAnsi="Arial"/>
@@ -12051,7 +12037,7 @@
               <w:rPr>
                 <w:sz w:val="21"/>
               </w:rPr>
-              <w:t>Confirm the media and news field sets and the statistics list with the owner (decision D6).</w:t>
+              <w:t>Confirm the media and news field sets and the statistics list with the owner.</w:t>
             </w:r>
           </w:p>
         </w:tc>
@@ -12106,7 +12092,7 @@
               <w:rPr>
                 <w:sz w:val="21"/>
               </w:rPr>
-              <w:t>Confirm the external providers as decision D7 closes (cognitive AI, live broadcast, WhatsApp).</w:t>
+              <w:t>Confirm the external providers when they are procured (cognitive AI, live broadcast, WhatsApp).</w:t>
             </w:r>
           </w:p>
         </w:tc>
@@ -12243,7 +12229,7 @@
         <w:pStyle w:val="Heading1"/>
         <w:spacing w:before="240" w:after="120"/>
       </w:pPr>
-      <w:bookmarkStart w:id="20" w:name="_Toc235386374"/>
+      <w:bookmarkStart w:id="20" w:name="_Toc235461071"/>
       <w:r>
         <w:rPr>
           <w:rFonts w:ascii="Arial" w:hAnsi="Arial"/>
@@ -12254,828 +12240,14 @@
       </w:r>
       <w:bookmarkEnd w:id="20"/>
     </w:p>
-    <w:tbl>
-      <w:tblPr>
-        <w:tblStyle w:val="TableGrid"/>
-        <w:tblW w:w="0" w:type="auto"/>
-        <w:jc w:val="center"/>
-        <w:tblLayout w:type="fixed"/>
-        <w:tblLook w:val="04A0" w:firstRow="1" w:lastRow="0" w:firstColumn="1" w:lastColumn="0" w:noHBand="0" w:noVBand="1"/>
-      </w:tblPr>
-      <w:tblGrid>
-        <w:gridCol w:w="680"/>
-        <w:gridCol w:w="4422"/>
-        <w:gridCol w:w="1134"/>
-        <w:gridCol w:w="1814"/>
-        <w:gridCol w:w="1587"/>
-      </w:tblGrid>
-      <w:tr>
-        <w:trPr>
-          <w:jc w:val="center"/>
-        </w:trPr>
-        <w:tc>
-          <w:tcPr>
-            <w:tcW w:w="680" w:type="dxa"/>
-            <w:shd w:val="clear" w:color="auto" w:fill="0D5341"/>
-          </w:tcPr>
-          <w:p>
-            <w:pPr>
-              <w:spacing w:before="40" w:after="40"/>
-              <w:jc w:val="center"/>
-            </w:pPr>
-            <w:r>
-              <w:rPr>
-                <w:b/>
-                <w:color w:val="FFFFFF"/>
-                <w:sz w:val="22"/>
-              </w:rPr>
-              <w:t>No.</w:t>
-            </w:r>
-          </w:p>
-        </w:tc>
-        <w:tc>
-          <w:tcPr>
-            <w:tcW w:w="4422" w:type="dxa"/>
-            <w:shd w:val="clear" w:color="auto" w:fill="0D5341"/>
-          </w:tcPr>
-          <w:p>
-            <w:pPr>
-              <w:spacing w:before="40" w:after="40"/>
-              <w:jc w:val="center"/>
-            </w:pPr>
-            <w:r>
-              <w:rPr>
-                <w:b/>
-                <w:color w:val="FFFFFF"/>
-                <w:sz w:val="22"/>
-              </w:rPr>
-              <w:t>Document Name</w:t>
-            </w:r>
-          </w:p>
-        </w:tc>
-        <w:tc>
-          <w:tcPr>
-            <w:tcW w:w="1134" w:type="dxa"/>
-            <w:shd w:val="clear" w:color="auto" w:fill="0D5341"/>
-          </w:tcPr>
-          <w:p>
-            <w:pPr>
-              <w:spacing w:before="40" w:after="40"/>
-              <w:jc w:val="center"/>
-            </w:pPr>
-            <w:r>
-              <w:rPr>
-                <w:b/>
-                <w:color w:val="FFFFFF"/>
-                <w:sz w:val="22"/>
-              </w:rPr>
-              <w:t>Version</w:t>
-            </w:r>
-          </w:p>
-        </w:tc>
-        <w:tc>
-          <w:tcPr>
-            <w:tcW w:w="1814" w:type="dxa"/>
-            <w:shd w:val="clear" w:color="auto" w:fill="0D5341"/>
-          </w:tcPr>
-          <w:p>
-            <w:pPr>
-              <w:spacing w:before="40" w:after="40"/>
-              <w:jc w:val="center"/>
-            </w:pPr>
-            <w:r>
-              <w:rPr>
-                <w:b/>
-                <w:color w:val="FFFFFF"/>
-                <w:sz w:val="22"/>
-              </w:rPr>
-              <w:t>Date</w:t>
-            </w:r>
-          </w:p>
-        </w:tc>
-        <w:tc>
-          <w:tcPr>
-            <w:tcW w:w="1587" w:type="dxa"/>
-            <w:shd w:val="clear" w:color="auto" w:fill="0D5341"/>
-          </w:tcPr>
-          <w:p>
-            <w:pPr>
-              <w:spacing w:before="40" w:after="40"/>
-              <w:jc w:val="center"/>
-            </w:pPr>
-            <w:r>
-              <w:rPr>
-                <w:b/>
-                <w:color w:val="FFFFFF"/>
-                <w:sz w:val="22"/>
-              </w:rPr>
-              <w:t>Attachment</w:t>
-            </w:r>
-          </w:p>
-        </w:tc>
-      </w:tr>
-      <w:tr>
-        <w:trPr>
-          <w:jc w:val="center"/>
-        </w:trPr>
-        <w:tc>
-          <w:tcPr>
-            <w:tcW w:w="680" w:type="dxa"/>
-          </w:tcPr>
-          <w:p>
-            <w:pPr>
-              <w:spacing w:before="40" w:after="40"/>
-            </w:pPr>
-            <w:r>
-              <w:rPr>
-                <w:sz w:val="21"/>
-              </w:rPr>
-              <w:t>1</w:t>
-            </w:r>
-          </w:p>
-        </w:tc>
-        <w:tc>
-          <w:tcPr>
-            <w:tcW w:w="4422" w:type="dxa"/>
-          </w:tcPr>
-          <w:p>
-            <w:pPr>
-              <w:spacing w:before="40" w:after="40"/>
-            </w:pPr>
-            <w:r>
-              <w:rPr>
-                <w:sz w:val="21"/>
-              </w:rPr>
-              <w:t>SIMF-SRS-001 Software Requirements Specification</w:t>
-            </w:r>
-          </w:p>
-        </w:tc>
-        <w:tc>
-          <w:tcPr>
-            <w:tcW w:w="1134" w:type="dxa"/>
-          </w:tcPr>
-          <w:p>
-            <w:pPr>
-              <w:spacing w:before="40" w:after="40"/>
-            </w:pPr>
-            <w:r>
-              <w:rPr>
-                <w:sz w:val="21"/>
-              </w:rPr>
-              <w:t>1.0</w:t>
-            </w:r>
-          </w:p>
-        </w:tc>
-        <w:tc>
-          <w:tcPr>
-            <w:tcW w:w="1814" w:type="dxa"/>
-          </w:tcPr>
-          <w:p>
-            <w:pPr>
-              <w:spacing w:before="40" w:after="40"/>
-            </w:pPr>
-            <w:r>
-              <w:rPr>
-                <w:sz w:val="21"/>
-              </w:rPr>
-              <w:t>20 May 2026</w:t>
-            </w:r>
-          </w:p>
-        </w:tc>
-        <w:tc>
-          <w:tcPr>
-            <w:tcW w:w="1587" w:type="dxa"/>
-          </w:tcPr>
-          <w:p>
-            <w:pPr>
-              <w:spacing w:before="40" w:after="40"/>
-            </w:pPr>
-            <w:r>
-              <w:rPr>
-                <w:sz w:val="21"/>
-              </w:rPr>
-              <w:t>Reference</w:t>
-            </w:r>
-          </w:p>
-        </w:tc>
-      </w:tr>
-      <w:tr>
-        <w:trPr>
-          <w:jc w:val="center"/>
-        </w:trPr>
-        <w:tc>
-          <w:tcPr>
-            <w:tcW w:w="680" w:type="dxa"/>
-            <w:shd w:val="clear" w:color="auto" w:fill="EAF1EE"/>
-          </w:tcPr>
-          <w:p>
-            <w:pPr>
-              <w:spacing w:before="40" w:after="40"/>
-            </w:pPr>
-            <w:r>
-              <w:rPr>
-                <w:sz w:val="21"/>
-              </w:rPr>
-              <w:t>2</w:t>
-            </w:r>
-          </w:p>
-        </w:tc>
-        <w:tc>
-          <w:tcPr>
-            <w:tcW w:w="4422" w:type="dxa"/>
-            <w:shd w:val="clear" w:color="auto" w:fill="EAF1EE"/>
-          </w:tcPr>
-          <w:p>
-            <w:pPr>
-              <w:spacing w:before="40" w:after="40"/>
-            </w:pPr>
-            <w:r>
-              <w:rPr>
-                <w:sz w:val="21"/>
-              </w:rPr>
-              <w:t>SIMF-SAD-001 Software Architecture Document</w:t>
-            </w:r>
-          </w:p>
-        </w:tc>
-        <w:tc>
-          <w:tcPr>
-            <w:tcW w:w="1134" w:type="dxa"/>
-            <w:shd w:val="clear" w:color="auto" w:fill="EAF1EE"/>
-          </w:tcPr>
-          <w:p>
-            <w:pPr>
-              <w:spacing w:before="40" w:after="40"/>
-            </w:pPr>
-            <w:r>
-              <w:rPr>
-                <w:sz w:val="21"/>
-              </w:rPr>
-              <w:t>1.0</w:t>
-            </w:r>
-          </w:p>
-        </w:tc>
-        <w:tc>
-          <w:tcPr>
-            <w:tcW w:w="1814" w:type="dxa"/>
-            <w:shd w:val="clear" w:color="auto" w:fill="EAF1EE"/>
-          </w:tcPr>
-          <w:p>
-            <w:pPr>
-              <w:spacing w:before="40" w:after="40"/>
-            </w:pPr>
-            <w:r>
-              <w:rPr>
-                <w:sz w:val="21"/>
-              </w:rPr>
-              <w:t>20 May 2026</w:t>
-            </w:r>
-          </w:p>
-        </w:tc>
-        <w:tc>
-          <w:tcPr>
-            <w:tcW w:w="1587" w:type="dxa"/>
-            <w:shd w:val="clear" w:color="auto" w:fill="EAF1EE"/>
-          </w:tcPr>
-          <w:p>
-            <w:pPr>
-              <w:spacing w:before="40" w:after="40"/>
-            </w:pPr>
-            <w:r>
-              <w:rPr>
-                <w:sz w:val="21"/>
-              </w:rPr>
-              <w:t>Reference</w:t>
-            </w:r>
-          </w:p>
-        </w:tc>
-      </w:tr>
-      <w:tr>
-        <w:trPr>
-          <w:jc w:val="center"/>
-        </w:trPr>
-        <w:tc>
-          <w:tcPr>
-            <w:tcW w:w="680" w:type="dxa"/>
-          </w:tcPr>
-          <w:p>
-            <w:pPr>
-              <w:spacing w:before="40" w:after="40"/>
-            </w:pPr>
-            <w:r>
-              <w:rPr>
-                <w:sz w:val="21"/>
-              </w:rPr>
-              <w:t>3</w:t>
-            </w:r>
-          </w:p>
-        </w:tc>
-        <w:tc>
-          <w:tcPr>
-            <w:tcW w:w="4422" w:type="dxa"/>
-          </w:tcPr>
-          <w:p>
-            <w:pPr>
-              <w:spacing w:before="40" w:after="40"/>
-            </w:pPr>
-            <w:r>
-              <w:rPr>
-                <w:sz w:val="21"/>
-              </w:rPr>
-              <w:t>SIMF-RPM-001 Roles and Permissions Specification</w:t>
-            </w:r>
-          </w:p>
-        </w:tc>
-        <w:tc>
-          <w:tcPr>
-            <w:tcW w:w="1134" w:type="dxa"/>
-          </w:tcPr>
-          <w:p>
-            <w:pPr>
-              <w:spacing w:before="40" w:after="40"/>
-            </w:pPr>
-            <w:r>
-              <w:rPr>
-                <w:sz w:val="21"/>
-              </w:rPr>
-              <w:t>1.3</w:t>
-            </w:r>
-          </w:p>
-        </w:tc>
-        <w:tc>
-          <w:tcPr>
-            <w:tcW w:w="1814" w:type="dxa"/>
-          </w:tcPr>
-          <w:p>
-            <w:pPr>
-              <w:spacing w:before="40" w:after="40"/>
-            </w:pPr>
-            <w:r>
-              <w:rPr>
-                <w:sz w:val="21"/>
-              </w:rPr>
-              <w:t>19 July 2026</w:t>
-            </w:r>
-          </w:p>
-        </w:tc>
-        <w:tc>
-          <w:tcPr>
-            <w:tcW w:w="1587" w:type="dxa"/>
-          </w:tcPr>
-          <w:p>
-            <w:pPr>
-              <w:spacing w:before="40" w:after="40"/>
-            </w:pPr>
-            <w:r>
-              <w:rPr>
-                <w:sz w:val="21"/>
-              </w:rPr>
-              <w:t>Reference</w:t>
-            </w:r>
-          </w:p>
-        </w:tc>
-      </w:tr>
-      <w:tr>
-        <w:trPr>
-          <w:jc w:val="center"/>
-        </w:trPr>
-        <w:tc>
-          <w:tcPr>
-            <w:tcW w:w="680" w:type="dxa"/>
-            <w:shd w:val="clear" w:color="auto" w:fill="EAF1EE"/>
-          </w:tcPr>
-          <w:p>
-            <w:pPr>
-              <w:spacing w:before="40" w:after="40"/>
-            </w:pPr>
-            <w:r>
-              <w:rPr>
-                <w:sz w:val="21"/>
-              </w:rPr>
-              <w:t>4</w:t>
-            </w:r>
-          </w:p>
-        </w:tc>
-        <w:tc>
-          <w:tcPr>
-            <w:tcW w:w="4422" w:type="dxa"/>
-            <w:shd w:val="clear" w:color="auto" w:fill="EAF1EE"/>
-          </w:tcPr>
-          <w:p>
-            <w:pPr>
-              <w:spacing w:before="40" w:after="40"/>
-            </w:pPr>
-            <w:r>
-              <w:rPr>
-                <w:sz w:val="21"/>
-              </w:rPr>
-              <w:t>SIMF-UCS-001 Use-Case Specifications</w:t>
-            </w:r>
-          </w:p>
-        </w:tc>
-        <w:tc>
-          <w:tcPr>
-            <w:tcW w:w="1134" w:type="dxa"/>
-            <w:shd w:val="clear" w:color="auto" w:fill="EAF1EE"/>
-          </w:tcPr>
-          <w:p>
-            <w:pPr>
-              <w:spacing w:before="40" w:after="40"/>
-            </w:pPr>
-            <w:r>
-              <w:rPr>
-                <w:sz w:val="21"/>
-              </w:rPr>
-              <w:t>1.0</w:t>
-            </w:r>
-          </w:p>
-        </w:tc>
-        <w:tc>
-          <w:tcPr>
-            <w:tcW w:w="1814" w:type="dxa"/>
-            <w:shd w:val="clear" w:color="auto" w:fill="EAF1EE"/>
-          </w:tcPr>
-          <w:p>
-            <w:pPr>
-              <w:spacing w:before="40" w:after="40"/>
-            </w:pPr>
-            <w:r>
-              <w:rPr>
-                <w:sz w:val="21"/>
-              </w:rPr>
-              <w:t>20 May 2026</w:t>
-            </w:r>
-          </w:p>
-        </w:tc>
-        <w:tc>
-          <w:tcPr>
-            <w:tcW w:w="1587" w:type="dxa"/>
-            <w:shd w:val="clear" w:color="auto" w:fill="EAF1EE"/>
-          </w:tcPr>
-          <w:p>
-            <w:pPr>
-              <w:spacing w:before="40" w:after="40"/>
-            </w:pPr>
-            <w:r>
-              <w:rPr>
-                <w:sz w:val="21"/>
-              </w:rPr>
-              <w:t>Reference</w:t>
-            </w:r>
-          </w:p>
-        </w:tc>
-      </w:tr>
-      <w:tr>
-        <w:trPr>
-          <w:jc w:val="center"/>
-        </w:trPr>
-        <w:tc>
-          <w:tcPr>
-            <w:tcW w:w="680" w:type="dxa"/>
-          </w:tcPr>
-          <w:p>
-            <w:pPr>
-              <w:spacing w:before="40" w:after="40"/>
-            </w:pPr>
-            <w:r>
-              <w:rPr>
-                <w:sz w:val="21"/>
-              </w:rPr>
-              <w:t>5</w:t>
-            </w:r>
-          </w:p>
-        </w:tc>
-        <w:tc>
-          <w:tcPr>
-            <w:tcW w:w="4422" w:type="dxa"/>
-          </w:tcPr>
-          <w:p>
-            <w:pPr>
-              <w:spacing w:before="40" w:after="40"/>
-            </w:pPr>
-            <w:r>
-              <w:rPr>
-                <w:sz w:val="21"/>
-              </w:rPr>
-              <w:t>SIMF-RDR-001 Requirements Decision Register</w:t>
-            </w:r>
-          </w:p>
-        </w:tc>
-        <w:tc>
-          <w:tcPr>
-            <w:tcW w:w="1134" w:type="dxa"/>
-          </w:tcPr>
-          <w:p>
-            <w:pPr>
-              <w:spacing w:before="40" w:after="40"/>
-            </w:pPr>
-            <w:r>
-              <w:rPr>
-                <w:sz w:val="21"/>
-              </w:rPr>
-              <w:t>1.0</w:t>
-            </w:r>
-          </w:p>
-        </w:tc>
-        <w:tc>
-          <w:tcPr>
-            <w:tcW w:w="1814" w:type="dxa"/>
-          </w:tcPr>
-          <w:p>
-            <w:pPr>
-              <w:spacing w:before="40" w:after="40"/>
-            </w:pPr>
-            <w:r>
-              <w:rPr>
-                <w:sz w:val="21"/>
-              </w:rPr>
-              <w:t>Not set</w:t>
-            </w:r>
-          </w:p>
-        </w:tc>
-        <w:tc>
-          <w:tcPr>
-            <w:tcW w:w="1587" w:type="dxa"/>
-          </w:tcPr>
-          <w:p>
-            <w:pPr>
-              <w:spacing w:before="40" w:after="40"/>
-            </w:pPr>
-            <w:r>
-              <w:rPr>
-                <w:sz w:val="21"/>
-              </w:rPr>
-              <w:t>Reference</w:t>
-            </w:r>
-          </w:p>
-        </w:tc>
-      </w:tr>
-      <w:tr>
-        <w:trPr>
-          <w:jc w:val="center"/>
-        </w:trPr>
-        <w:tc>
-          <w:tcPr>
-            <w:tcW w:w="680" w:type="dxa"/>
-            <w:shd w:val="clear" w:color="auto" w:fill="EAF1EE"/>
-          </w:tcPr>
-          <w:p>
-            <w:pPr>
-              <w:spacing w:before="40" w:after="40"/>
-            </w:pPr>
-            <w:r>
-              <w:rPr>
-                <w:sz w:val="21"/>
-              </w:rPr>
-              <w:t>6</w:t>
-            </w:r>
-          </w:p>
-        </w:tc>
-        <w:tc>
-          <w:tcPr>
-            <w:tcW w:w="4422" w:type="dxa"/>
-            <w:shd w:val="clear" w:color="auto" w:fill="EAF1EE"/>
-          </w:tcPr>
-          <w:p>
-            <w:pPr>
-              <w:spacing w:before="40" w:after="40"/>
-            </w:pPr>
-            <w:r>
-              <w:rPr>
-                <w:sz w:val="21"/>
-              </w:rPr>
-              <w:t>SIMF-API-001 API Specification</w:t>
-            </w:r>
-          </w:p>
-        </w:tc>
-        <w:tc>
-          <w:tcPr>
-            <w:tcW w:w="1134" w:type="dxa"/>
-            <w:shd w:val="clear" w:color="auto" w:fill="EAF1EE"/>
-          </w:tcPr>
-          <w:p>
-            <w:pPr>
-              <w:spacing w:before="40" w:after="40"/>
-            </w:pPr>
-            <w:r>
-              <w:rPr>
-                <w:sz w:val="21"/>
-              </w:rPr>
-              <w:t>1.3</w:t>
-            </w:r>
-          </w:p>
-        </w:tc>
-        <w:tc>
-          <w:tcPr>
-            <w:tcW w:w="1814" w:type="dxa"/>
-            <w:shd w:val="clear" w:color="auto" w:fill="EAF1EE"/>
-          </w:tcPr>
-          <w:p>
-            <w:pPr>
-              <w:spacing w:before="40" w:after="40"/>
-            </w:pPr>
-            <w:r>
-              <w:rPr>
-                <w:sz w:val="21"/>
-              </w:rPr>
-              <w:t>20 May 2026</w:t>
-            </w:r>
-          </w:p>
-        </w:tc>
-        <w:tc>
-          <w:tcPr>
-            <w:tcW w:w="1587" w:type="dxa"/>
-            <w:shd w:val="clear" w:color="auto" w:fill="EAF1EE"/>
-          </w:tcPr>
-          <w:p>
-            <w:pPr>
-              <w:spacing w:before="40" w:after="40"/>
-            </w:pPr>
-            <w:r>
-              <w:rPr>
-                <w:sz w:val="21"/>
-              </w:rPr>
-              <w:t>Reference</w:t>
-            </w:r>
-          </w:p>
-        </w:tc>
-      </w:tr>
-      <w:tr>
-        <w:trPr>
-          <w:jc w:val="center"/>
-        </w:trPr>
-        <w:tc>
-          <w:tcPr>
-            <w:tcW w:w="680" w:type="dxa"/>
-          </w:tcPr>
-          <w:p>
-            <w:pPr>
-              <w:spacing w:before="40" w:after="40"/>
-            </w:pPr>
-            <w:r>
-              <w:rPr>
-                <w:sz w:val="21"/>
-              </w:rPr>
-              <w:t>7</w:t>
-            </w:r>
-          </w:p>
-        </w:tc>
-        <w:tc>
-          <w:tcPr>
-            <w:tcW w:w="4422" w:type="dxa"/>
-          </w:tcPr>
-          <w:p>
-            <w:pPr>
-              <w:spacing w:before="40" w:after="40"/>
-            </w:pPr>
-            <w:r>
-              <w:rPr>
-                <w:sz w:val="21"/>
-              </w:rPr>
-              <w:t>SIMF-SES-001 Software Engineering Standards and Conventions</w:t>
-            </w:r>
-          </w:p>
-        </w:tc>
-        <w:tc>
-          <w:tcPr>
-            <w:tcW w:w="1134" w:type="dxa"/>
-          </w:tcPr>
-          <w:p>
-            <w:pPr>
-              <w:spacing w:before="40" w:after="40"/>
-            </w:pPr>
-            <w:r>
-              <w:rPr>
-                <w:sz w:val="21"/>
-              </w:rPr>
-              <w:t>1.1</w:t>
-            </w:r>
-          </w:p>
-        </w:tc>
-        <w:tc>
-          <w:tcPr>
-            <w:tcW w:w="1814" w:type="dxa"/>
-          </w:tcPr>
-          <w:p>
-            <w:pPr>
-              <w:spacing w:before="40" w:after="40"/>
-            </w:pPr>
-            <w:r>
-              <w:rPr>
-                <w:sz w:val="21"/>
-              </w:rPr>
-              <w:t>20 May 2026</w:t>
-            </w:r>
-          </w:p>
-        </w:tc>
-        <w:tc>
-          <w:tcPr>
-            <w:tcW w:w="1587" w:type="dxa"/>
-          </w:tcPr>
-          <w:p>
-            <w:pPr>
-              <w:spacing w:before="40" w:after="40"/>
-            </w:pPr>
-            <w:r>
-              <w:rPr>
-                <w:sz w:val="21"/>
-              </w:rPr>
-              <w:t>Reference</w:t>
-            </w:r>
-          </w:p>
-        </w:tc>
-      </w:tr>
-      <w:tr>
-        <w:trPr>
-          <w:jc w:val="center"/>
-        </w:trPr>
-        <w:tc>
-          <w:tcPr>
-            <w:tcW w:w="680" w:type="dxa"/>
-            <w:shd w:val="clear" w:color="auto" w:fill="EAF1EE"/>
-          </w:tcPr>
-          <w:p>
-            <w:pPr>
-              <w:spacing w:before="40" w:after="40"/>
-            </w:pPr>
-            <w:r>
-              <w:rPr>
-                <w:sz w:val="21"/>
-              </w:rPr>
-              <w:t>8</w:t>
-            </w:r>
-          </w:p>
-        </w:tc>
-        <w:tc>
-          <w:tcPr>
-            <w:tcW w:w="4422" w:type="dxa"/>
-            <w:shd w:val="clear" w:color="auto" w:fill="EAF1EE"/>
-          </w:tcPr>
-          <w:p>
-            <w:pPr>
-              <w:spacing w:before="40" w:after="40"/>
-            </w:pPr>
-            <w:r>
-              <w:rPr>
-                <w:sz w:val="21"/>
-              </w:rPr>
-              <w:t>SIMF-VID-001 Visual Identity and Design Tokens</w:t>
-            </w:r>
-          </w:p>
-        </w:tc>
-        <w:tc>
-          <w:tcPr>
-            <w:tcW w:w="1134" w:type="dxa"/>
-            <w:shd w:val="clear" w:color="auto" w:fill="EAF1EE"/>
-          </w:tcPr>
-          <w:p>
-            <w:pPr>
-              <w:spacing w:before="40" w:after="40"/>
-            </w:pPr>
-            <w:r>
-              <w:rPr>
-                <w:sz w:val="21"/>
-              </w:rPr>
-              <w:t>1.2</w:t>
-            </w:r>
-          </w:p>
-        </w:tc>
-        <w:tc>
-          <w:tcPr>
-            <w:tcW w:w="1814" w:type="dxa"/>
-            <w:shd w:val="clear" w:color="auto" w:fill="EAF1EE"/>
-          </w:tcPr>
-          <w:p>
-            <w:pPr>
-              <w:spacing w:before="40" w:after="40"/>
-            </w:pPr>
-            <w:r>
-              <w:rPr>
-                <w:sz w:val="21"/>
-              </w:rPr>
-              <w:t>20 May 2026</w:t>
-            </w:r>
-          </w:p>
-        </w:tc>
-        <w:tc>
-          <w:tcPr>
-            <w:tcW w:w="1587" w:type="dxa"/>
-            <w:shd w:val="clear" w:color="auto" w:fill="EAF1EE"/>
-          </w:tcPr>
-          <w:p>
-            <w:pPr>
-              <w:spacing w:before="40" w:after="40"/>
-            </w:pPr>
-            <w:r>
-              <w:rPr>
-                <w:sz w:val="21"/>
-              </w:rPr>
-              <w:t>Reference</w:t>
-            </w:r>
-          </w:p>
-        </w:tc>
-      </w:tr>
-    </w:tbl>
-    <w:p/>
+    <w:p>
+      <w:pPr>
+        <w:spacing w:after="120"/>
+      </w:pPr>
+      <w:r>
+        <w:t>This document is delivered as a standalone document and has no attachments.</w:t>
+      </w:r>
+    </w:p>
     <w:sectPr>
       <w:pgSz w:w="11906" w:h="16838"/>
       <w:pgMar w:top="907" w:right="1134" w:bottom="1020" w:left="1134" w:header="720" w:footer="720" w:gutter="0"/>
@@ -13259,31 +12431,31 @@
       </w:rPr>
     </w:lvl>
   </w:abstractNum>
-  <w:num w:numId="1" w16cid:durableId="801312739">
+  <w:num w:numId="1" w16cid:durableId="1824002452">
     <w:abstractNumId w:val="8"/>
   </w:num>
-  <w:num w:numId="2" w16cid:durableId="2104177657">
+  <w:num w:numId="2" w16cid:durableId="804005081">
     <w:abstractNumId w:val="6"/>
   </w:num>
-  <w:num w:numId="3" w16cid:durableId="1996110300">
+  <w:num w:numId="3" w16cid:durableId="1526552211">
     <w:abstractNumId w:val="5"/>
   </w:num>
-  <w:num w:numId="4" w16cid:durableId="1976060502">
+  <w:num w:numId="4" w16cid:durableId="119299763">
     <w:abstractNumId w:val="4"/>
   </w:num>
-  <w:num w:numId="5" w16cid:durableId="991060782">
+  <w:num w:numId="5" w16cid:durableId="1521309069">
     <w:abstractNumId w:val="7"/>
   </w:num>
-  <w:num w:numId="6" w16cid:durableId="512764288">
+  <w:num w:numId="6" w16cid:durableId="1507940059">
     <w:abstractNumId w:val="3"/>
   </w:num>
-  <w:num w:numId="7" w16cid:durableId="840394254">
+  <w:num w:numId="7" w16cid:durableId="983044111">
     <w:abstractNumId w:val="2"/>
   </w:num>
-  <w:num w:numId="8" w16cid:durableId="1924874105">
+  <w:num w:numId="8" w16cid:durableId="452866416">
     <w:abstractNumId w:val="1"/>
   </w:num>
-  <w:num w:numId="9" w16cid:durableId="1979726299">
+  <w:num w:numId="9" w16cid:durableId="324944126">
     <w:abstractNumId w:val="0"/>
   </w:num>
 </w:numbering>
@@ -24679,7 +23851,7 @@
     <w:autoRedefine/>
     <w:uiPriority w:val="39"/>
     <w:unhideWhenUsed/>
-    <w:rsid w:val="00826806"/>
+    <w:rsid w:val="00507121"/>
     <w:pPr>
       <w:spacing w:after="100"/>
     </w:pPr>
@@ -24691,7 +23863,7 @@
     <w:autoRedefine/>
     <w:uiPriority w:val="39"/>
     <w:unhideWhenUsed/>
-    <w:rsid w:val="00826806"/>
+    <w:rsid w:val="00507121"/>
     <w:pPr>
       <w:spacing w:after="100"/>
       <w:ind w:left="240"/>
@@ -24704,7 +23876,7 @@
     <w:autoRedefine/>
     <w:uiPriority w:val="39"/>
     <w:unhideWhenUsed/>
-    <w:rsid w:val="00826806"/>
+    <w:rsid w:val="00507121"/>
     <w:pPr>
       <w:spacing w:after="100"/>
       <w:ind w:left="480"/>
@@ -24715,7 +23887,7 @@
     <w:basedOn w:val="DefaultParagraphFont"/>
     <w:uiPriority w:val="99"/>
     <w:unhideWhenUsed/>
-    <w:rsid w:val="00826806"/>
+    <w:rsid w:val="00507121"/>
     <w:rPr>
       <w:color w:val="0000FF" w:themeColor="hyperlink"/>
       <w:u w:val="single"/>

</xml_diff>

<commit_message>
docs(brd): add BPMN process diagrams to section 3 + final review fixes (EN + AR)
Section 3 Business Process now carries three BPMN v2 process diagrams
(registration and approval; seat booking and attendance; live session
engagement) in both languages, satisfying the MoD template requirement
for diagrams alongside the text.

Also applies the final pre-delivery deep-review fixes: sponsor tiers set
to the as-built four (Platinum, Gold, Silver, Bronze); FR-104 now
includes device-biometric sign-in; the GPS geofence chain reconciled as
a deferred enhancement (QR check-in binding); leftover D6/D7 codes and
dangling references removed; FR-1208 added for per-edition Control-Panel
configuration; Arabic phrasing and EN/AR parity corrected throughout.

Co-Authored-By: Claude Opus 4.8 (1M context) <noreply@anthropic.com>
</commit_message>
<xml_diff>
--- a/docs/SIMF-BRD-001-Business-Requirements-Document-EN.docx
+++ b/docs/SIMF-BRD-001-Business-Requirements-Document-EN.docx
@@ -11,7 +11,7 @@
           <w:noProof/>
         </w:rPr>
         <w:drawing>
-          <wp:inline distT="0" distB="0" distL="0" distR="0" wp14:anchorId="7A9B92CC" wp14:editId="3D5B8A2E">
+          <wp:inline distT="0" distB="0" distL="0" distR="0" wp14:anchorId="5AB6F6FE" wp14:editId="382E6137">
             <wp:extent cx="2592000" cy="946286"/>
             <wp:effectExtent l="0" t="0" r="0" b="0"/>
             <wp:docPr id="1" name="Picture 1"/>
@@ -1013,7 +1013,7 @@
       <w:r>
         <w:fldChar w:fldCharType="separate"/>
       </w:r>
-      <w:hyperlink w:anchor="_Toc235478980" w:history="1">
+      <w:hyperlink w:anchor="_Toc235514809" w:history="1">
         <w:r>
           <w:rPr>
             <w:rStyle w:val="Hyperlink"/>
@@ -1040,7 +1040,7 @@
             <w:noProof/>
             <w:webHidden/>
           </w:rPr>
-          <w:instrText xml:space="preserve"> PAGEREF _Toc235478980 \h </w:instrText>
+          <w:instrText xml:space="preserve"> PAGEREF _Toc235514809 \h </w:instrText>
         </w:r>
         <w:r>
           <w:rPr>
@@ -1085,7 +1085,7 @@
           <w14:ligatures w14:val="standardContextual"/>
         </w:rPr>
       </w:pPr>
-      <w:hyperlink w:anchor="_Toc235478981" w:history="1">
+      <w:hyperlink w:anchor="_Toc235514810" w:history="1">
         <w:r>
           <w:rPr>
             <w:rStyle w:val="Hyperlink"/>
@@ -1112,7 +1112,7 @@
             <w:noProof/>
             <w:webHidden/>
           </w:rPr>
-          <w:instrText xml:space="preserve"> PAGEREF _Toc235478981 \h </w:instrText>
+          <w:instrText xml:space="preserve"> PAGEREF _Toc235514810 \h </w:instrText>
         </w:r>
         <w:r>
           <w:rPr>
@@ -1157,7 +1157,7 @@
           <w14:ligatures w14:val="standardContextual"/>
         </w:rPr>
       </w:pPr>
-      <w:hyperlink w:anchor="_Toc235478982" w:history="1">
+      <w:hyperlink w:anchor="_Toc235514811" w:history="1">
         <w:r>
           <w:rPr>
             <w:rStyle w:val="Hyperlink"/>
@@ -1184,7 +1184,7 @@
             <w:noProof/>
             <w:webHidden/>
           </w:rPr>
-          <w:instrText xml:space="preserve"> PAGEREF _Toc235478982 \h </w:instrText>
+          <w:instrText xml:space="preserve"> PAGEREF _Toc235514811 \h </w:instrText>
         </w:r>
         <w:r>
           <w:rPr>
@@ -1229,7 +1229,7 @@
           <w14:ligatures w14:val="standardContextual"/>
         </w:rPr>
       </w:pPr>
-      <w:hyperlink w:anchor="_Toc235478983" w:history="1">
+      <w:hyperlink w:anchor="_Toc235514812" w:history="1">
         <w:r>
           <w:rPr>
             <w:rStyle w:val="Hyperlink"/>
@@ -1256,7 +1256,7 @@
             <w:noProof/>
             <w:webHidden/>
           </w:rPr>
-          <w:instrText xml:space="preserve"> PAGEREF _Toc235478983 \h </w:instrText>
+          <w:instrText xml:space="preserve"> PAGEREF _Toc235514812 \h </w:instrText>
         </w:r>
         <w:r>
           <w:rPr>
@@ -1301,7 +1301,7 @@
           <w14:ligatures w14:val="standardContextual"/>
         </w:rPr>
       </w:pPr>
-      <w:hyperlink w:anchor="_Toc235478984" w:history="1">
+      <w:hyperlink w:anchor="_Toc235514813" w:history="1">
         <w:r>
           <w:rPr>
             <w:rStyle w:val="Hyperlink"/>
@@ -1328,7 +1328,7 @@
             <w:noProof/>
             <w:webHidden/>
           </w:rPr>
-          <w:instrText xml:space="preserve"> PAGEREF _Toc235478984 \h </w:instrText>
+          <w:instrText xml:space="preserve"> PAGEREF _Toc235514813 \h </w:instrText>
         </w:r>
         <w:r>
           <w:rPr>
@@ -1373,7 +1373,7 @@
           <w14:ligatures w14:val="standardContextual"/>
         </w:rPr>
       </w:pPr>
-      <w:hyperlink w:anchor="_Toc235478985" w:history="1">
+      <w:hyperlink w:anchor="_Toc235514814" w:history="1">
         <w:r>
           <w:rPr>
             <w:rStyle w:val="Hyperlink"/>
@@ -1400,7 +1400,7 @@
             <w:noProof/>
             <w:webHidden/>
           </w:rPr>
-          <w:instrText xml:space="preserve"> PAGEREF _Toc235478985 \h </w:instrText>
+          <w:instrText xml:space="preserve"> PAGEREF _Toc235514814 \h </w:instrText>
         </w:r>
         <w:r>
           <w:rPr>
@@ -1445,7 +1445,7 @@
           <w14:ligatures w14:val="standardContextual"/>
         </w:rPr>
       </w:pPr>
-      <w:hyperlink w:anchor="_Toc235478986" w:history="1">
+      <w:hyperlink w:anchor="_Toc235514815" w:history="1">
         <w:r>
           <w:rPr>
             <w:rStyle w:val="Hyperlink"/>
@@ -1472,7 +1472,7 @@
             <w:noProof/>
             <w:webHidden/>
           </w:rPr>
-          <w:instrText xml:space="preserve"> PAGEREF _Toc235478986 \h </w:instrText>
+          <w:instrText xml:space="preserve"> PAGEREF _Toc235514815 \h </w:instrText>
         </w:r>
         <w:r>
           <w:rPr>
@@ -1517,7 +1517,7 @@
           <w14:ligatures w14:val="standardContextual"/>
         </w:rPr>
       </w:pPr>
-      <w:hyperlink w:anchor="_Toc235478987" w:history="1">
+      <w:hyperlink w:anchor="_Toc235514816" w:history="1">
         <w:r>
           <w:rPr>
             <w:rStyle w:val="Hyperlink"/>
@@ -1544,7 +1544,7 @@
             <w:noProof/>
             <w:webHidden/>
           </w:rPr>
-          <w:instrText xml:space="preserve"> PAGEREF _Toc235478987 \h </w:instrText>
+          <w:instrText xml:space="preserve"> PAGEREF _Toc235514816 \h </w:instrText>
         </w:r>
         <w:r>
           <w:rPr>
@@ -1589,7 +1589,7 @@
           <w14:ligatures w14:val="standardContextual"/>
         </w:rPr>
       </w:pPr>
-      <w:hyperlink w:anchor="_Toc235478988" w:history="1">
+      <w:hyperlink w:anchor="_Toc235514817" w:history="1">
         <w:r>
           <w:rPr>
             <w:rStyle w:val="Hyperlink"/>
@@ -1616,7 +1616,7 @@
             <w:noProof/>
             <w:webHidden/>
           </w:rPr>
-          <w:instrText xml:space="preserve"> PAGEREF _Toc235478988 \h </w:instrText>
+          <w:instrText xml:space="preserve"> PAGEREF _Toc235514817 \h </w:instrText>
         </w:r>
         <w:r>
           <w:rPr>
@@ -1661,7 +1661,7 @@
           <w14:ligatures w14:val="standardContextual"/>
         </w:rPr>
       </w:pPr>
-      <w:hyperlink w:anchor="_Toc235478989" w:history="1">
+      <w:hyperlink w:anchor="_Toc235514818" w:history="1">
         <w:r>
           <w:rPr>
             <w:rStyle w:val="Hyperlink"/>
@@ -1688,7 +1688,7 @@
             <w:noProof/>
             <w:webHidden/>
           </w:rPr>
-          <w:instrText xml:space="preserve"> PAGEREF _Toc235478989 \h </w:instrText>
+          <w:instrText xml:space="preserve"> PAGEREF _Toc235514818 \h </w:instrText>
         </w:r>
         <w:r>
           <w:rPr>
@@ -1733,7 +1733,7 @@
           <w14:ligatures w14:val="standardContextual"/>
         </w:rPr>
       </w:pPr>
-      <w:hyperlink w:anchor="_Toc235478990" w:history="1">
+      <w:hyperlink w:anchor="_Toc235514819" w:history="1">
         <w:r>
           <w:rPr>
             <w:rStyle w:val="Hyperlink"/>
@@ -1760,7 +1760,7 @@
             <w:noProof/>
             <w:webHidden/>
           </w:rPr>
-          <w:instrText xml:space="preserve"> PAGEREF _Toc235478990 \h </w:instrText>
+          <w:instrText xml:space="preserve"> PAGEREF _Toc235514819 \h </w:instrText>
         </w:r>
         <w:r>
           <w:rPr>
@@ -1805,7 +1805,7 @@
           <w14:ligatures w14:val="standardContextual"/>
         </w:rPr>
       </w:pPr>
-      <w:hyperlink w:anchor="_Toc235478991" w:history="1">
+      <w:hyperlink w:anchor="_Toc235514820" w:history="1">
         <w:r>
           <w:rPr>
             <w:rStyle w:val="Hyperlink"/>
@@ -1832,7 +1832,7 @@
             <w:noProof/>
             <w:webHidden/>
           </w:rPr>
-          <w:instrText xml:space="preserve"> PAGEREF _Toc235478991 \h </w:instrText>
+          <w:instrText xml:space="preserve"> PAGEREF _Toc235514820 \h </w:instrText>
         </w:r>
         <w:r>
           <w:rPr>
@@ -1852,7 +1852,7 @@
             <w:noProof/>
             <w:webHidden/>
           </w:rPr>
-          <w:t>8</w:t>
+          <w:t>10</w:t>
         </w:r>
         <w:r>
           <w:rPr>
@@ -1877,7 +1877,7 @@
           <w14:ligatures w14:val="standardContextual"/>
         </w:rPr>
       </w:pPr>
-      <w:hyperlink w:anchor="_Toc235478992" w:history="1">
+      <w:hyperlink w:anchor="_Toc235514821" w:history="1">
         <w:r>
           <w:rPr>
             <w:rStyle w:val="Hyperlink"/>
@@ -1904,7 +1904,7 @@
             <w:noProof/>
             <w:webHidden/>
           </w:rPr>
-          <w:instrText xml:space="preserve"> PAGEREF _Toc235478992 \h </w:instrText>
+          <w:instrText xml:space="preserve"> PAGEREF _Toc235514821 \h </w:instrText>
         </w:r>
         <w:r>
           <w:rPr>
@@ -1924,7 +1924,7 @@
             <w:noProof/>
             <w:webHidden/>
           </w:rPr>
-          <w:t>8</w:t>
+          <w:t>11</w:t>
         </w:r>
         <w:r>
           <w:rPr>
@@ -1949,7 +1949,7 @@
           <w14:ligatures w14:val="standardContextual"/>
         </w:rPr>
       </w:pPr>
-      <w:hyperlink w:anchor="_Toc235478993" w:history="1">
+      <w:hyperlink w:anchor="_Toc235514822" w:history="1">
         <w:r>
           <w:rPr>
             <w:rStyle w:val="Hyperlink"/>
@@ -1976,7 +1976,7 @@
             <w:noProof/>
             <w:webHidden/>
           </w:rPr>
-          <w:instrText xml:space="preserve"> PAGEREF _Toc235478993 \h </w:instrText>
+          <w:instrText xml:space="preserve"> PAGEREF _Toc235514822 \h </w:instrText>
         </w:r>
         <w:r>
           <w:rPr>
@@ -1996,7 +1996,7 @@
             <w:noProof/>
             <w:webHidden/>
           </w:rPr>
-          <w:t>8</w:t>
+          <w:t>11</w:t>
         </w:r>
         <w:r>
           <w:rPr>
@@ -2021,7 +2021,7 @@
           <w14:ligatures w14:val="standardContextual"/>
         </w:rPr>
       </w:pPr>
-      <w:hyperlink w:anchor="_Toc235478994" w:history="1">
+      <w:hyperlink w:anchor="_Toc235514823" w:history="1">
         <w:r>
           <w:rPr>
             <w:rStyle w:val="Hyperlink"/>
@@ -2048,7 +2048,7 @@
             <w:noProof/>
             <w:webHidden/>
           </w:rPr>
-          <w:instrText xml:space="preserve"> PAGEREF _Toc235478994 \h </w:instrText>
+          <w:instrText xml:space="preserve"> PAGEREF _Toc235514823 \h </w:instrText>
         </w:r>
         <w:r>
           <w:rPr>
@@ -2068,7 +2068,7 @@
             <w:noProof/>
             <w:webHidden/>
           </w:rPr>
-          <w:t>9</w:t>
+          <w:t>11</w:t>
         </w:r>
         <w:r>
           <w:rPr>
@@ -2093,7 +2093,7 @@
           <w14:ligatures w14:val="standardContextual"/>
         </w:rPr>
       </w:pPr>
-      <w:hyperlink w:anchor="_Toc235478995" w:history="1">
+      <w:hyperlink w:anchor="_Toc235514824" w:history="1">
         <w:r>
           <w:rPr>
             <w:rStyle w:val="Hyperlink"/>
@@ -2120,7 +2120,7 @@
             <w:noProof/>
             <w:webHidden/>
           </w:rPr>
-          <w:instrText xml:space="preserve"> PAGEREF _Toc235478995 \h </w:instrText>
+          <w:instrText xml:space="preserve"> PAGEREF _Toc235514824 \h </w:instrText>
         </w:r>
         <w:r>
           <w:rPr>
@@ -2140,7 +2140,7 @@
             <w:noProof/>
             <w:webHidden/>
           </w:rPr>
-          <w:t>13</w:t>
+          <w:t>15</w:t>
         </w:r>
         <w:r>
           <w:rPr>
@@ -2165,7 +2165,7 @@
           <w14:ligatures w14:val="standardContextual"/>
         </w:rPr>
       </w:pPr>
-      <w:hyperlink w:anchor="_Toc235478996" w:history="1">
+      <w:hyperlink w:anchor="_Toc235514825" w:history="1">
         <w:r>
           <w:rPr>
             <w:rStyle w:val="Hyperlink"/>
@@ -2192,7 +2192,7 @@
             <w:noProof/>
             <w:webHidden/>
           </w:rPr>
-          <w:instrText xml:space="preserve"> PAGEREF _Toc235478996 \h </w:instrText>
+          <w:instrText xml:space="preserve"> PAGEREF _Toc235514825 \h </w:instrText>
         </w:r>
         <w:r>
           <w:rPr>
@@ -2212,7 +2212,7 @@
             <w:noProof/>
             <w:webHidden/>
           </w:rPr>
-          <w:t>13</w:t>
+          <w:t>16</w:t>
         </w:r>
         <w:r>
           <w:rPr>
@@ -2237,7 +2237,7 @@
           <w14:ligatures w14:val="standardContextual"/>
         </w:rPr>
       </w:pPr>
-      <w:hyperlink w:anchor="_Toc235478997" w:history="1">
+      <w:hyperlink w:anchor="_Toc235514826" w:history="1">
         <w:r>
           <w:rPr>
             <w:rStyle w:val="Hyperlink"/>
@@ -2264,7 +2264,7 @@
             <w:noProof/>
             <w:webHidden/>
           </w:rPr>
-          <w:instrText xml:space="preserve"> PAGEREF _Toc235478997 \h </w:instrText>
+          <w:instrText xml:space="preserve"> PAGEREF _Toc235514826 \h </w:instrText>
         </w:r>
         <w:r>
           <w:rPr>
@@ -2284,7 +2284,7 @@
             <w:noProof/>
             <w:webHidden/>
           </w:rPr>
-          <w:t>14</w:t>
+          <w:t>16</w:t>
         </w:r>
         <w:r>
           <w:rPr>
@@ -2309,7 +2309,7 @@
           <w14:ligatures w14:val="standardContextual"/>
         </w:rPr>
       </w:pPr>
-      <w:hyperlink w:anchor="_Toc235478998" w:history="1">
+      <w:hyperlink w:anchor="_Toc235514827" w:history="1">
         <w:r>
           <w:rPr>
             <w:rStyle w:val="Hyperlink"/>
@@ -2336,7 +2336,7 @@
             <w:noProof/>
             <w:webHidden/>
           </w:rPr>
-          <w:instrText xml:space="preserve"> PAGEREF _Toc235478998 \h </w:instrText>
+          <w:instrText xml:space="preserve"> PAGEREF _Toc235514827 \h </w:instrText>
         </w:r>
         <w:r>
           <w:rPr>
@@ -2356,7 +2356,7 @@
             <w:noProof/>
             <w:webHidden/>
           </w:rPr>
-          <w:t>14</w:t>
+          <w:t>16</w:t>
         </w:r>
         <w:r>
           <w:rPr>
@@ -2381,7 +2381,7 @@
           <w14:ligatures w14:val="standardContextual"/>
         </w:rPr>
       </w:pPr>
-      <w:hyperlink w:anchor="_Toc235478999" w:history="1">
+      <w:hyperlink w:anchor="_Toc235514828" w:history="1">
         <w:r>
           <w:rPr>
             <w:rStyle w:val="Hyperlink"/>
@@ -2408,7 +2408,7 @@
             <w:noProof/>
             <w:webHidden/>
           </w:rPr>
-          <w:instrText xml:space="preserve"> PAGEREF _Toc235478999 \h </w:instrText>
+          <w:instrText xml:space="preserve"> PAGEREF _Toc235514828 \h </w:instrText>
         </w:r>
         <w:r>
           <w:rPr>
@@ -2428,7 +2428,7 @@
             <w:noProof/>
             <w:webHidden/>
           </w:rPr>
-          <w:t>14</w:t>
+          <w:t>17</w:t>
         </w:r>
         <w:r>
           <w:rPr>
@@ -2453,7 +2453,7 @@
           <w14:ligatures w14:val="standardContextual"/>
         </w:rPr>
       </w:pPr>
-      <w:hyperlink w:anchor="_Toc235479000" w:history="1">
+      <w:hyperlink w:anchor="_Toc235514829" w:history="1">
         <w:r>
           <w:rPr>
             <w:rStyle w:val="Hyperlink"/>
@@ -2480,7 +2480,7 @@
             <w:noProof/>
             <w:webHidden/>
           </w:rPr>
-          <w:instrText xml:space="preserve"> PAGEREF _Toc235479000 \h </w:instrText>
+          <w:instrText xml:space="preserve"> PAGEREF _Toc235514829 \h </w:instrText>
         </w:r>
         <w:r>
           <w:rPr>
@@ -2500,7 +2500,7 @@
             <w:noProof/>
             <w:webHidden/>
           </w:rPr>
-          <w:t>14</w:t>
+          <w:t>17</w:t>
         </w:r>
         <w:r>
           <w:rPr>
@@ -3109,7 +3109,7 @@
               <w:rPr>
                 <w:sz w:val="21"/>
               </w:rPr>
-              <w:t>The second authentication factor required for internal-user sign-in.</w:t>
+              <w:t>Multi-factor authentication / time-based one-time password; the second authentication factor required for internal-user sign-in.</w:t>
             </w:r>
           </w:p>
         </w:tc>
@@ -3492,7 +3492,7 @@
               <w:rPr>
                 <w:sz w:val="21"/>
               </w:rPr>
-              <w:t>Global Positioning System; used for hall presence and movement inside the venue.</w:t>
+              <w:t>Global Positioning System; the basis of the deferred in-venue presence and movement capability.</w:t>
             </w:r>
           </w:p>
         </w:tc>
@@ -3602,6 +3602,168 @@
                 <w:sz w:val="21"/>
               </w:rPr>
               <w:t>Domain-Driven Design; the layering approach followed in the engineering standards.</w:t>
+            </w:r>
+          </w:p>
+        </w:tc>
+      </w:tr>
+      <w:tr>
+        <w:trPr>
+          <w:jc w:val="center"/>
+        </w:trPr>
+        <w:tc>
+          <w:tcPr>
+            <w:tcW w:w="680" w:type="dxa"/>
+          </w:tcPr>
+          <w:p>
+            <w:pPr>
+              <w:spacing w:before="40" w:after="40"/>
+            </w:pPr>
+            <w:r>
+              <w:rPr>
+                <w:sz w:val="21"/>
+              </w:rPr>
+              <w:t>19</w:t>
+            </w:r>
+          </w:p>
+        </w:tc>
+        <w:tc>
+          <w:tcPr>
+            <w:tcW w:w="2438" w:type="dxa"/>
+          </w:tcPr>
+          <w:p>
+            <w:pPr>
+              <w:spacing w:before="40" w:after="40"/>
+            </w:pPr>
+            <w:r>
+              <w:rPr>
+                <w:sz w:val="21"/>
+              </w:rPr>
+              <w:t>AI</w:t>
+            </w:r>
+          </w:p>
+        </w:tc>
+        <w:tc>
+          <w:tcPr>
+            <w:tcW w:w="6520" w:type="dxa"/>
+          </w:tcPr>
+          <w:p>
+            <w:pPr>
+              <w:spacing w:before="40" w:after="40"/>
+            </w:pPr>
+            <w:r>
+              <w:rPr>
+                <w:sz w:val="21"/>
+              </w:rPr>
+              <w:t>Artificial intelligence; used for the assistant, session summaries, comment moderation, translation and recommendations.</w:t>
+            </w:r>
+          </w:p>
+        </w:tc>
+      </w:tr>
+      <w:tr>
+        <w:trPr>
+          <w:jc w:val="center"/>
+        </w:trPr>
+        <w:tc>
+          <w:tcPr>
+            <w:tcW w:w="680" w:type="dxa"/>
+            <w:shd w:val="clear" w:color="auto" w:fill="EAF1EE"/>
+          </w:tcPr>
+          <w:p>
+            <w:pPr>
+              <w:spacing w:before="40" w:after="40"/>
+            </w:pPr>
+            <w:r>
+              <w:rPr>
+                <w:sz w:val="21"/>
+              </w:rPr>
+              <w:t>20</w:t>
+            </w:r>
+          </w:p>
+        </w:tc>
+        <w:tc>
+          <w:tcPr>
+            <w:tcW w:w="2438" w:type="dxa"/>
+            <w:shd w:val="clear" w:color="auto" w:fill="EAF1EE"/>
+          </w:tcPr>
+          <w:p>
+            <w:pPr>
+              <w:spacing w:before="40" w:after="40"/>
+            </w:pPr>
+            <w:r>
+              <w:rPr>
+                <w:sz w:val="21"/>
+              </w:rPr>
+              <w:t>SMS</w:t>
+            </w:r>
+          </w:p>
+        </w:tc>
+        <w:tc>
+          <w:tcPr>
+            <w:tcW w:w="6520" w:type="dxa"/>
+            <w:shd w:val="clear" w:color="auto" w:fill="EAF1EE"/>
+          </w:tcPr>
+          <w:p>
+            <w:pPr>
+              <w:spacing w:before="40" w:after="40"/>
+            </w:pPr>
+            <w:r>
+              <w:rPr>
+                <w:sz w:val="21"/>
+              </w:rPr>
+              <w:t>Short message service; one of the four notification channels.</w:t>
+            </w:r>
+          </w:p>
+        </w:tc>
+      </w:tr>
+      <w:tr>
+        <w:trPr>
+          <w:jc w:val="center"/>
+        </w:trPr>
+        <w:tc>
+          <w:tcPr>
+            <w:tcW w:w="680" w:type="dxa"/>
+          </w:tcPr>
+          <w:p>
+            <w:pPr>
+              <w:spacing w:before="40" w:after="40"/>
+            </w:pPr>
+            <w:r>
+              <w:rPr>
+                <w:sz w:val="21"/>
+              </w:rPr>
+              <w:t>21</w:t>
+            </w:r>
+          </w:p>
+        </w:tc>
+        <w:tc>
+          <w:tcPr>
+            <w:tcW w:w="2438" w:type="dxa"/>
+          </w:tcPr>
+          <w:p>
+            <w:pPr>
+              <w:spacing w:before="40" w:after="40"/>
+            </w:pPr>
+            <w:r>
+              <w:rPr>
+                <w:sz w:val="21"/>
+              </w:rPr>
+              <w:t>RTL / LTR</w:t>
+            </w:r>
+          </w:p>
+        </w:tc>
+        <w:tc>
+          <w:tcPr>
+            <w:tcW w:w="6520" w:type="dxa"/>
+          </w:tcPr>
+          <w:p>
+            <w:pPr>
+              <w:spacing w:before="40" w:after="40"/>
+            </w:pPr>
+            <w:r>
+              <w:rPr>
+                <w:sz w:val="21"/>
+              </w:rPr>
+              <w:t>Right-to-left / left-to-right text direction (Arabic / English).</w:t>
             </w:r>
           </w:p>
         </w:tc>
@@ -3617,7 +3779,7 @@
         <w:pStyle w:val="Heading1"/>
         <w:spacing w:before="240" w:after="120"/>
       </w:pPr>
-      <w:bookmarkStart w:id="0" w:name="_Toc235478980"/>
+      <w:bookmarkStart w:id="0" w:name="_Toc235514809"/>
       <w:r>
         <w:rPr>
           <w:rFonts w:ascii="Arial" w:hAnsi="Arial"/>
@@ -3633,7 +3795,7 @@
         <w:pStyle w:val="Heading2"/>
         <w:spacing w:before="160" w:after="120"/>
       </w:pPr>
-      <w:bookmarkStart w:id="1" w:name="_Toc235478981"/>
+      <w:bookmarkStart w:id="1" w:name="_Toc235514810"/>
       <w:r>
         <w:rPr>
           <w:rFonts w:ascii="Arial" w:hAnsi="Arial"/>
@@ -3656,7 +3818,7 @@
         <w:spacing w:after="120"/>
       </w:pPr>
       <w:r>
-        <w:t>It defines the objectives and scope of the solution and records the requirements agreed with the owner, so the analysis, design, development and testing teams work from a single approved reference and each requirement can be traced into design, code and tests through a stable identifier. It is written at the business level, above the detailed software requirements and the per-feature design work.</w:t>
+        <w:t>It defines the objectives and scope of the solution and records the requirements agreed with the owner, so the analysis, design, development, testing and quality-assurance teams work from a single approved reference and each requirement can be traced into design, code and tests through a stable identifier. It is written at the business level, above the detailed software requirements and the per-feature design work.</w:t>
       </w:r>
     </w:p>
     <w:p>
@@ -3664,7 +3826,7 @@
         <w:pStyle w:val="Heading2"/>
         <w:spacing w:before="160" w:after="120"/>
       </w:pPr>
-      <w:bookmarkStart w:id="2" w:name="_Toc235478982"/>
+      <w:bookmarkStart w:id="2" w:name="_Toc235514811"/>
       <w:r>
         <w:rPr>
           <w:rFonts w:ascii="Arial" w:hAnsi="Arial"/>
@@ -3809,7 +3971,7 @@
               <w:rPr>
                 <w:sz w:val="21"/>
               </w:rPr>
-              <w:t>- Take the open decisions (statistics list and media fields D6; external providers D7).</w:t>
+              <w:t>- Take the open decisions (the statistics list and media fields, OI-1; the external providers, OI-2).</w:t>
             </w:r>
           </w:p>
         </w:tc>
@@ -4016,7 +4178,7 @@
               <w:rPr>
                 <w:sz w:val="21"/>
               </w:rPr>
-              <w:t>- Approve registrations and set the final user type and permissions.</w:t>
+              <w:t>- Set the final user type and permissions for approved registrations.</w:t>
             </w:r>
           </w:p>
         </w:tc>
@@ -4027,7 +4189,7 @@
         <w:pStyle w:val="Heading1"/>
         <w:spacing w:before="240" w:after="120"/>
       </w:pPr>
-      <w:bookmarkStart w:id="3" w:name="_Toc235478983"/>
+      <w:bookmarkStart w:id="3" w:name="_Toc235514812"/>
       <w:r>
         <w:rPr>
           <w:rFonts w:ascii="Arial" w:hAnsi="Arial"/>
@@ -4043,7 +4205,7 @@
         <w:pStyle w:val="Heading2"/>
         <w:spacing w:before="160" w:after="120"/>
       </w:pPr>
-      <w:bookmarkStart w:id="4" w:name="_Toc235478984"/>
+      <w:bookmarkStart w:id="4" w:name="_Toc235514813"/>
       <w:r>
         <w:rPr>
           <w:rFonts w:ascii="Arial" w:hAnsi="Arial"/>
@@ -4058,10 +4220,13 @@
         <w:spacing w:after="120"/>
       </w:pPr>
       <w:r>
-        <w:t>The Saudi International Maritime Forum is a recurring event, and this is its fourth edition. Each previous edition ran on its own separately built systems, website and app, produced from scratch for that edition and then set aside. Rebuilding every time is costly and slow, scatters each edition's data in a different place, leaves no single reusable platform and no consolidated record across editions, and forces the cybersecurity controls, the technology choices and any intelligent features to be re-solved f</w:t>
+        <w:t xml:space="preserve">The Saudi International Maritime Forum is a recurring event, and this is its fourth edition. Each previous edition ran on its own separately built systems, website and app, produced from scratch for that edition and then set aside. Rebuilding every time is costly and slow, scatters each edition's data in a different place, leaves no single reusable platform and no consolidated record across editions, and forces the cybersecurity controls, the technology choices and any intelligent features to be worked out </w:t>
       </w:r>
       <w:r>
-        <w:t>rom the ground up each time. What is needed is one dynamic, configurable system and app, built on modern technology, embedding AI and emerging technologies, and compliant with the National Cybersecurity Authority (NCA) standards, that can serve the current edition and every future edition without being rebuilt, with all editions' data held in one central location. The requirements in this document are based on the material provided by the owner and a series of interviews with the owner's representatives.</w:t>
+        <w:t>again from the ground up for every edition. What is needed is one dynamic, configurable system and app, built on modern technology, embedding AI and emerging technologies, and compliant with the National Cybersecurity Authority (NCA) standards, that can serve the current edition and every future edition without being rebuilt, with all editions' data held in one central location. The requirements in this document are based on the material provided by the owner and a series of interviews with the owner's repr</w:t>
+      </w:r>
+      <w:r>
+        <w:t>esentatives.</w:t>
       </w:r>
     </w:p>
     <w:p>
@@ -4069,7 +4234,7 @@
         <w:pStyle w:val="Heading2"/>
         <w:spacing w:before="160" w:after="120"/>
       </w:pPr>
-      <w:bookmarkStart w:id="5" w:name="_Toc235478985"/>
+      <w:bookmarkStart w:id="5" w:name="_Toc235514814"/>
       <w:r>
         <w:rPr>
           <w:rFonts w:ascii="Arial" w:hAnsi="Arial"/>
@@ -4084,7 +4249,7 @@
         <w:spacing w:after="120"/>
       </w:pPr>
       <w:r>
-        <w:t>Each edition of the forum has been delivered on its own bespoke systems, website and app, built specifically for that edition. Nothing carries over: the event identity, content, categories and dates are fixed per edition, each edition's data is stored separately, and a new build, with its own security posture and technology, is commissioned every time the forum is held. There is no single configurable platform, no centralized store spanning the editions, and no consistent, reusable base for cybersecurity co</w:t>
+        <w:t>Each edition of the forum has been delivered on its own bespoke systems, website and app, built specifically for that edition. Nothing carries over: the event identity, content, categories and dates are fixed per edition, each edition's data is stored separately, and a new build, with its own security posture and technology, is commissioned every time the forum is held. There is no single configurable platform, no centralised store spanning the editions, and no consistent, reusable base for cybersecurity co</w:t>
       </w:r>
       <w:r>
         <w:t>mpliance or for AI-assisted features.</w:t>
@@ -4095,7 +4260,7 @@
         <w:pStyle w:val="Heading2"/>
         <w:spacing w:before="160" w:after="120"/>
       </w:pPr>
-      <w:bookmarkStart w:id="6" w:name="_Toc235478986"/>
+      <w:bookmarkStart w:id="6" w:name="_Toc235514815"/>
       <w:r>
         <w:rPr>
           <w:rFonts w:ascii="Arial" w:hAnsi="Arial"/>
@@ -4113,10 +4278,10 @@
         <w:t>Design one dynamic, reusable platform, a single backend and unified API serving the administrative Control Panel, the public website and the attendee mobile app, that can run any edition of the forum without code changes. Everything that varies between editions is configured from the Control Panel: the event name, the colours, the logos and visual identity, the content and data, the categories, the start and end dates, and the archiving of past editions. All editions' data is held in one central location, s</w:t>
       </w:r>
       <w:r>
-        <w:t>o the same system is valid for the current edition and every future exhibition. The platform is built on a modern technology stack, embeds AI and emerging technologies (a cognitive assistant and knowledge base, AI-generated session summaries, AI comment moderation, AI live translation and accessibility, and smart attendee and session recommendations), and is engineered to comply with the National Cybersecurity Authority (NCA) standards. On this dynamic base the platform covers the full event lifecycle: regi</w:t>
+        <w:t>o the same system is valid for the current edition and every future edition. The platform is built on a modern technology stack, embeds AI and emerging technologies (a cognitive assistant and knowledge base, AI-generated session summaries, AI comment moderation, AI live translation and accessibility, and smart attendee and session recommendations), and is engineered to comply with the National Cybersecurity Authority (NCA) standards. On this dynamic base the platform covers the full event lifecycle: registr</w:t>
       </w:r>
       <w:r>
-        <w:t>stration, security vetting and approval, badge issue and access control, the programme, sessions and bookings, live streaming and engagement, networking between attendees, the exhibition and sponsors, media and news and archive, notifications and statistics, running on-premises as a single tenant.</w:t>
+        <w:t>ation, security vetting and approval, badge issue and access control, the programme, sessions and bookings, live streaming and engagement, networking between attendees, the exhibition and sponsors, media and news and archive, notifications and statistics, running on-premises as a single tenant.</w:t>
       </w:r>
     </w:p>
     <w:p>
@@ -4124,7 +4289,7 @@
         <w:pStyle w:val="Heading3"/>
         <w:spacing w:before="160" w:after="120"/>
       </w:pPr>
-      <w:bookmarkStart w:id="7" w:name="_Toc235478987"/>
+      <w:bookmarkStart w:id="7" w:name="_Toc235514816"/>
       <w:r>
         <w:rPr>
           <w:rFonts w:ascii="Arial" w:hAnsi="Arial"/>
@@ -4247,7 +4412,7 @@
         <w:pStyle w:val="Heading3"/>
         <w:spacing w:before="160" w:after="120"/>
       </w:pPr>
-      <w:bookmarkStart w:id="8" w:name="_Toc235478988"/>
+      <w:bookmarkStart w:id="8" w:name="_Toc235514817"/>
       <w:r>
         <w:rPr>
           <w:rFonts w:ascii="Arial" w:hAnsi="Arial"/>
@@ -4266,7 +4431,7 @@
         <w:rPr>
           <w:sz w:val="23"/>
         </w:rPr>
-        <w:t>The dynamic configuration layer (event name, colours, logos and visual identity, categories, start and end dates, content and archiving) and the centralized multi-edition data store.</w:t>
+        <w:t>The dynamic configuration layer (event name, colours, logos and visual identity, categories, start and end dates, content and archiving) and the centralised multi-edition data store.</w:t>
       </w:r>
     </w:p>
     <w:p>
@@ -4370,7 +4535,7 @@
         <w:pStyle w:val="Heading3"/>
         <w:spacing w:before="160" w:after="120"/>
       </w:pPr>
-      <w:bookmarkStart w:id="9" w:name="_Toc235478989"/>
+      <w:bookmarkStart w:id="9" w:name="_Toc235514818"/>
       <w:r>
         <w:rPr>
           <w:rFonts w:ascii="Arial" w:hAnsi="Arial"/>
@@ -4389,7 +4554,7 @@
         <w:rPr>
           <w:sz w:val="23"/>
         </w:rPr>
-        <w:t>Procuring the cognitive-AI provider, the live-broadcast platform and the WhatsApp provider; these are reached through abstractions and the provider is chosen later.</w:t>
+        <w:t>Procuring the cognitive-AI provider, the live-broadcast platform and the WhatsApp provider; these are reached through abstractions and the providers are chosen later.</w:t>
       </w:r>
     </w:p>
     <w:p>
@@ -4413,7 +4578,7 @@
         <w:rPr>
           <w:sz w:val="23"/>
         </w:rPr>
-        <w:t>The full GPS geofence chain (arrival to attendance to movement) and question gating on arrival; deferred pending the venue-boundary decision (open item G-OI-2).</w:t>
+        <w:t>The GPS geofence chain (automatic arrival detection, and attendance and movement tracking from GPS presence); deferred pending the venue-boundary decision (open item G-OI-2). Arrival and attendance are recorded by QR check-in at the hall.</w:t>
       </w:r>
     </w:p>
     <w:p>
@@ -4445,7 +4610,7 @@
         <w:pStyle w:val="Heading1"/>
         <w:spacing w:before="240" w:after="120"/>
       </w:pPr>
-      <w:bookmarkStart w:id="10" w:name="_Toc235478990"/>
+      <w:bookmarkStart w:id="10" w:name="_Toc235514819"/>
       <w:r>
         <w:rPr>
           <w:rFonts w:ascii="Arial" w:hAnsi="Arial"/>
@@ -4466,7 +4631,7 @@
           <w:color w:val="595959"/>
           <w:sz w:val="21"/>
         </w:rPr>
-        <w:t>The following describes the main business processes of the proposed solution in prose. BPMN process diagrams will be added in a later revision of the document.</w:t>
+        <w:t>The following describes the main business processes of the proposed solution. A BPMN process diagram for each of the three core flows follows the descriptions.</w:t>
       </w:r>
     </w:p>
     <w:p>
@@ -4514,7 +4679,7 @@
         <w:rPr>
           <w:sz w:val="23"/>
         </w:rPr>
-        <w:t>Bookings: an attendee books a specific seat (with no time overlap), the reservation is confirmed immediately, the seat is confirmed at hall-gate check-in, and the booking can be cancelled before the session starts.</w:t>
+        <w:t>Bookings: an attendee registers to attend a session or, in halls with assigned seating, reserves a specific seat (with no time overlap); the reservation confirms immediately with no approval, a reserved seat is cancelled automatically 3 minutes before the session starts if the attendee has not checked in, and the attendee checks in and out of the session at the hall.</w:t>
       </w:r>
     </w:p>
     <w:p>
@@ -4526,7 +4691,7 @@
         <w:rPr>
           <w:sz w:val="23"/>
         </w:rPr>
-        <w:t>Live session and engagement: a session is streamed with live translation or captions; questions open after the attendee is verified as arrived and close at session end; the moderator manages the questions assigned to them; comments pass through an AI filter and then an admin review before being shown.</w:t>
+        <w:t>Live session and engagement: a session is streamed with live translation or captions; questions open after the attendee has checked in at the hall and close at session end; the moderator manages the questions assigned to them; comments pass through an AI filter and then an admin review before being shown.</w:t>
       </w:r>
     </w:p>
     <w:p>
@@ -4555,10 +4720,190 @@
     </w:p>
     <w:p>
       <w:pPr>
+        <w:spacing w:before="160"/>
+        <w:jc w:val="center"/>
+      </w:pPr>
+      <w:r>
+        <w:rPr>
+          <w:noProof/>
+        </w:rPr>
+        <w:drawing>
+          <wp:inline distT="0" distB="0" distL="0" distR="0" wp14:anchorId="665446E1" wp14:editId="4A302604">
+            <wp:extent cx="5580000" cy="4776102"/>
+            <wp:effectExtent l="0" t="0" r="0" b="0"/>
+            <wp:docPr id="2" name="Picture 2"/>
+            <wp:cNvGraphicFramePr>
+              <a:graphicFrameLocks xmlns:a="http://schemas.openxmlformats.org/drawingml/2006/main" noChangeAspect="1"/>
+            </wp:cNvGraphicFramePr>
+            <a:graphic xmlns:a="http://schemas.openxmlformats.org/drawingml/2006/main">
+              <a:graphicData uri="http://schemas.openxmlformats.org/drawingml/2006/picture">
+                <pic:pic xmlns:pic="http://schemas.openxmlformats.org/drawingml/2006/picture">
+                  <pic:nvPicPr>
+                    <pic:cNvPr id="0" name="bpmn_d1_en.png"/>
+                    <pic:cNvPicPr/>
+                  </pic:nvPicPr>
+                  <pic:blipFill>
+                    <a:blip r:embed="rId7"/>
+                    <a:stretch>
+                      <a:fillRect/>
+                    </a:stretch>
+                  </pic:blipFill>
+                  <pic:spPr>
+                    <a:xfrm>
+                      <a:off x="0" y="0"/>
+                      <a:ext cx="5580000" cy="4776102"/>
+                    </a:xfrm>
+                    <a:prstGeom prst="rect">
+                      <a:avLst/>
+                    </a:prstGeom>
+                  </pic:spPr>
+                </pic:pic>
+              </a:graphicData>
+            </a:graphic>
+          </wp:inline>
+        </w:drawing>
+      </w:r>
+    </w:p>
+    <w:p>
+      <w:pPr>
+        <w:spacing w:after="240"/>
+        <w:jc w:val="center"/>
+      </w:pPr>
+      <w:r>
+        <w:rPr>
+          <w:i/>
+          <w:color w:val="595959"/>
+          <w:sz w:val="19"/>
+        </w:rPr>
+        <w:t>Figure 1. Registration and approval process.</w:t>
+      </w:r>
+    </w:p>
+    <w:p>
+      <w:pPr>
+        <w:spacing w:before="160"/>
+        <w:jc w:val="center"/>
+      </w:pPr>
+      <w:r>
+        <w:rPr>
+          <w:noProof/>
+        </w:rPr>
+        <w:drawing>
+          <wp:inline distT="0" distB="0" distL="0" distR="0" wp14:anchorId="342F4018" wp14:editId="13BAADFD">
+            <wp:extent cx="5580000" cy="5296271"/>
+            <wp:effectExtent l="0" t="0" r="0" b="0"/>
+            <wp:docPr id="3" name="Picture 3"/>
+            <wp:cNvGraphicFramePr>
+              <a:graphicFrameLocks xmlns:a="http://schemas.openxmlformats.org/drawingml/2006/main" noChangeAspect="1"/>
+            </wp:cNvGraphicFramePr>
+            <a:graphic xmlns:a="http://schemas.openxmlformats.org/drawingml/2006/main">
+              <a:graphicData uri="http://schemas.openxmlformats.org/drawingml/2006/picture">
+                <pic:pic xmlns:pic="http://schemas.openxmlformats.org/drawingml/2006/picture">
+                  <pic:nvPicPr>
+                    <pic:cNvPr id="0" name="bpmn_d2_en.png"/>
+                    <pic:cNvPicPr/>
+                  </pic:nvPicPr>
+                  <pic:blipFill>
+                    <a:blip r:embed="rId8"/>
+                    <a:stretch>
+                      <a:fillRect/>
+                    </a:stretch>
+                  </pic:blipFill>
+                  <pic:spPr>
+                    <a:xfrm>
+                      <a:off x="0" y="0"/>
+                      <a:ext cx="5580000" cy="5296271"/>
+                    </a:xfrm>
+                    <a:prstGeom prst="rect">
+                      <a:avLst/>
+                    </a:prstGeom>
+                  </pic:spPr>
+                </pic:pic>
+              </a:graphicData>
+            </a:graphic>
+          </wp:inline>
+        </w:drawing>
+      </w:r>
+    </w:p>
+    <w:p>
+      <w:pPr>
+        <w:spacing w:after="240"/>
+        <w:jc w:val="center"/>
+      </w:pPr>
+      <w:r>
+        <w:rPr>
+          <w:i/>
+          <w:color w:val="595959"/>
+          <w:sz w:val="19"/>
+        </w:rPr>
+        <w:t>Figure 2. Seat booking and attendance process.</w:t>
+      </w:r>
+    </w:p>
+    <w:p>
+      <w:pPr>
+        <w:spacing w:before="160"/>
+        <w:jc w:val="center"/>
+      </w:pPr>
+      <w:r>
+        <w:rPr>
+          <w:noProof/>
+        </w:rPr>
+        <w:drawing>
+          <wp:inline distT="0" distB="0" distL="0" distR="0" wp14:anchorId="7BB19182" wp14:editId="662816D2">
+            <wp:extent cx="5580000" cy="5012542"/>
+            <wp:effectExtent l="0" t="0" r="0" b="0"/>
+            <wp:docPr id="4" name="Picture 4"/>
+            <wp:cNvGraphicFramePr>
+              <a:graphicFrameLocks xmlns:a="http://schemas.openxmlformats.org/drawingml/2006/main" noChangeAspect="1"/>
+            </wp:cNvGraphicFramePr>
+            <a:graphic xmlns:a="http://schemas.openxmlformats.org/drawingml/2006/main">
+              <a:graphicData uri="http://schemas.openxmlformats.org/drawingml/2006/picture">
+                <pic:pic xmlns:pic="http://schemas.openxmlformats.org/drawingml/2006/picture">
+                  <pic:nvPicPr>
+                    <pic:cNvPr id="0" name="bpmn_d3_en.png"/>
+                    <pic:cNvPicPr/>
+                  </pic:nvPicPr>
+                  <pic:blipFill>
+                    <a:blip r:embed="rId9"/>
+                    <a:stretch>
+                      <a:fillRect/>
+                    </a:stretch>
+                  </pic:blipFill>
+                  <pic:spPr>
+                    <a:xfrm>
+                      <a:off x="0" y="0"/>
+                      <a:ext cx="5580000" cy="5012542"/>
+                    </a:xfrm>
+                    <a:prstGeom prst="rect">
+                      <a:avLst/>
+                    </a:prstGeom>
+                  </pic:spPr>
+                </pic:pic>
+              </a:graphicData>
+            </a:graphic>
+          </wp:inline>
+        </w:drawing>
+      </w:r>
+    </w:p>
+    <w:p>
+      <w:pPr>
+        <w:spacing w:after="240"/>
+        <w:jc w:val="center"/>
+      </w:pPr>
+      <w:r>
+        <w:rPr>
+          <w:i/>
+          <w:color w:val="595959"/>
+          <w:sz w:val="19"/>
+        </w:rPr>
+        <w:t>Figure 3. Live session engagement process.</w:t>
+      </w:r>
+    </w:p>
+    <w:p>
+      <w:pPr>
         <w:pStyle w:val="Heading1"/>
         <w:spacing w:before="240" w:after="120"/>
       </w:pPr>
-      <w:bookmarkStart w:id="11" w:name="_Toc235478991"/>
+      <w:bookmarkStart w:id="11" w:name="_Toc235514820"/>
       <w:r>
         <w:rPr>
           <w:rFonts w:ascii="Arial" w:hAnsi="Arial"/>
@@ -5102,7 +5447,7 @@
         <w:pStyle w:val="Heading1"/>
         <w:spacing w:before="240" w:after="120"/>
       </w:pPr>
-      <w:bookmarkStart w:id="12" w:name="_Toc235478992"/>
+      <w:bookmarkStart w:id="12" w:name="_Toc235514821"/>
       <w:r>
         <w:rPr>
           <w:rFonts w:ascii="Arial" w:hAnsi="Arial"/>
@@ -5118,7 +5463,7 @@
         <w:pStyle w:val="Heading2"/>
         <w:spacing w:before="160" w:after="120"/>
       </w:pPr>
-      <w:bookmarkStart w:id="13" w:name="_Toc235478993"/>
+      <w:bookmarkStart w:id="13" w:name="_Toc235514822"/>
       <w:r>
         <w:rPr>
           <w:rFonts w:ascii="Arial" w:hAnsi="Arial"/>
@@ -5217,7 +5562,7 @@
               <w:rPr>
                 <w:sz w:val="21"/>
               </w:rPr>
-              <w:t>No sign-in or access to any page or endpoint is allowed without a permission, except sign-in, sign-up and password reset.</w:t>
+              <w:t>Access to every page and endpoint requires a permission; the only anonymous functions are sign-in, sign-up and password reset.</w:t>
             </w:r>
           </w:p>
         </w:tc>
@@ -5293,7 +5638,7 @@
               <w:rPr>
                 <w:sz w:val="21"/>
               </w:rPr>
-              <w:t>The final user type and permissions are set when the Admin approves the registration.</w:t>
+              <w:t>The Security team approves or rejects a registration; on approval the Admin sets the final user type and permissions.</w:t>
             </w:r>
           </w:p>
         </w:tc>
@@ -5445,7 +5790,7 @@
               <w:rPr>
                 <w:sz w:val="21"/>
               </w:rPr>
-              <w:t>A session's questions open only after the attendee is verified as arrived at the hall, and close at session end.</w:t>
+              <w:t>A session's questions open only after the attendee has checked in at the hall, and close at session end.</w:t>
             </w:r>
           </w:p>
         </w:tc>
@@ -5723,7 +6068,7 @@
         <w:pStyle w:val="Heading2"/>
         <w:spacing w:before="160" w:after="120"/>
       </w:pPr>
-      <w:bookmarkStart w:id="14" w:name="_Toc235478994"/>
+      <w:bookmarkStart w:id="14" w:name="_Toc235514823"/>
       <w:r>
         <w:rPr>
           <w:rFonts w:ascii="Arial" w:hAnsi="Arial"/>
@@ -5743,7 +6088,7 @@
           <w:color w:val="595959"/>
           <w:sz w:val="21"/>
         </w:rPr>
-        <w:t>The table lists the user requirements grouped by service, with a stable identifier per requirement for traceability. Each requirement is stated as a binding obligation in the form "The system shall &lt;function&gt;".</w:t>
+        <w:t>The table lists the user requirements grouped by service, with a stable identifier per requirement for traceability. Each requirement states what the system is obliged to provide; rows recording open items are marked as such.</w:t>
       </w:r>
     </w:p>
     <w:tbl>
@@ -5971,7 +6316,7 @@
               <w:rPr>
                 <w:sz w:val="19"/>
               </w:rPr>
-              <w:t>The system shall send a six-digit verification code to the email and shall require the code to be entered before the account proceeds.</w:t>
+              <w:t>The system shall send a six-digit verification code to the email and shall require the code to be entered before the registration can continue.</w:t>
             </w:r>
           </w:p>
         </w:tc>
@@ -6077,7 +6422,7 @@
               <w:rPr>
                 <w:sz w:val="19"/>
               </w:rPr>
-              <w:t>The system shall authenticate a user by email and password. It shall not offer Nafath or Face ID sign-in.</w:t>
+              <w:t>The system shall authenticate a user by email and password, and the mobile app shall additionally offer device-biometric sign-in (fingerprint or Face ID) once the account is set up on the device. Nafath sign-in is not offered.</w:t>
             </w:r>
           </w:p>
         </w:tc>
@@ -6632,7 +6977,7 @@
               <w:rPr>
                 <w:sz w:val="19"/>
               </w:rPr>
-              <w:t>The system shall let the user select a venue track or zone after registration.</w:t>
+              <w:t>The system shall let the user select the venue zone (area of the venue) they plan to attend, after registration.</w:t>
             </w:r>
           </w:p>
         </w:tc>
@@ -7505,7 +7850,7 @@
               <w:rPr>
                 <w:sz w:val="19"/>
               </w:rPr>
-              <w:t>The system shall record a user's arrival at a session hall by both a QR scan at the hall door and a GPS geofence around the hall, and shall hold an enter time and a leave time per session.</w:t>
+              <w:t>The system shall record a user's arrival at a session hall by a QR scan at the hall door, and shall hold an enter time and a leave time per session; automatic arrival detection by a GPS geofence around the hall is a deferred enhancement (open item G-OI-2).</w:t>
             </w:r>
           </w:p>
         </w:tc>
@@ -7583,7 +7928,7 @@
               <w:rPr>
                 <w:sz w:val="19"/>
               </w:rPr>
-              <w:t>The system shall let the Scientific team manage the five themes or pillars and their sub-topics.</w:t>
+              <w:t>The system shall let the Scientific team manage the forum themes or pillars and their sub-topics.</w:t>
             </w:r>
           </w:p>
         </w:tc>
@@ -7901,7 +8246,7 @@
               <w:rPr>
                 <w:sz w:val="19"/>
               </w:rPr>
-              <w:t>The system shall hold the presentation files speakers present.</w:t>
+              <w:t>The system shall hold the presentation files delivered by speakers.</w:t>
             </w:r>
           </w:p>
         </w:tc>
@@ -8587,7 +8932,7 @@
               <w:rPr>
                 <w:sz w:val="19"/>
               </w:rPr>
-              <w:t>The system shall maintain sponsors in three tiers: Strategic, Premium and Gold.</w:t>
+              <w:t>The system shall maintain sponsors in four tiers: Platinum, Gold, Silver and Bronze.</w:t>
             </w:r>
           </w:p>
         </w:tc>
@@ -8824,7 +9169,7 @@
               <w:rPr>
                 <w:sz w:val="19"/>
               </w:rPr>
-              <w:t>The system shall let an attendee send a question to the moderator during a session, addressed to the speaker or the host.</w:t>
+              <w:t>The system shall let an attendee send a question to the moderator during a session, addressed to the session's speaker or its host (chair).</w:t>
             </w:r>
           </w:p>
         </w:tc>
@@ -8877,7 +9222,7 @@
               <w:rPr>
                 <w:sz w:val="19"/>
               </w:rPr>
-              <w:t>The system shall open a session's questions only after the attendee is verified as arrived at the hall, and shall close them at session end.</w:t>
+              <w:t>The system shall open a session's questions only after the attendee has checked in at the hall, and shall close them at session end.</w:t>
             </w:r>
           </w:p>
         </w:tc>
@@ -8930,7 +9275,7 @@
               <w:rPr>
                 <w:sz w:val="19"/>
               </w:rPr>
-              <w:t>The system shall let a moderator, for the sessions assigned to them, view, order, hide and put questions to the speaker.</w:t>
+              <w:t>The system shall let a moderator, for the sessions assigned to them, view the incoming questions, reorder or hide them, and put selected questions to the speaker.</w:t>
             </w:r>
           </w:p>
         </w:tc>
@@ -9722,7 +10067,7 @@
               <w:rPr>
                 <w:sz w:val="19"/>
               </w:rPr>
-              <w:t>The system shall confirm a seat reservation immediately in the app, with no notification sent on reserving, and shall send reminders when a session has started and the user has not attended or has not entered.</w:t>
+              <w:t>The system shall confirm a seat reservation immediately in the app, with no notification sent on reserving, and shall send a reminder when a session has started and the user has not checked in.</w:t>
             </w:r>
           </w:p>
         </w:tc>
@@ -10302,7 +10647,7 @@
               <w:rPr>
                 <w:sz w:val="19"/>
               </w:rPr>
-              <w:t>The system shall track attendee movement, dwell time and routes inside the venue from GPS presence, and reflect attendance live on the Control Panel dashboard.</w:t>
+              <w:t>The system shall show attendance live on the Control Panel dashboard; tracking attendee movement, dwell time and routes inside the venue from GPS presence is a deferred enhancement (open item G-OI-2).</w:t>
             </w:r>
           </w:p>
         </w:tc>
@@ -10752,6 +11097,59 @@
                 <w:sz w:val="19"/>
               </w:rPr>
               <w:t>The system shall present the Policies and the Terms and Conditions, using legal text supplied by the client.</w:t>
+            </w:r>
+          </w:p>
+        </w:tc>
+      </w:tr>
+      <w:tr>
+        <w:trPr>
+          <w:jc w:val="center"/>
+        </w:trPr>
+        <w:tc>
+          <w:tcPr>
+            <w:tcW w:w="2409" w:type="dxa"/>
+            <w:vMerge/>
+          </w:tcPr>
+          <w:p/>
+        </w:tc>
+        <w:tc>
+          <w:tcPr>
+            <w:tcW w:w="2409" w:type="dxa"/>
+            <w:vMerge/>
+          </w:tcPr>
+          <w:p/>
+        </w:tc>
+        <w:tc>
+          <w:tcPr>
+            <w:tcW w:w="1077" w:type="dxa"/>
+          </w:tcPr>
+          <w:p>
+            <w:pPr>
+              <w:spacing w:before="40" w:after="40"/>
+              <w:jc w:val="center"/>
+            </w:pPr>
+            <w:r>
+              <w:rPr>
+                <w:b/>
+                <w:sz w:val="19"/>
+              </w:rPr>
+              <w:t>FR-1208</w:t>
+            </w:r>
+          </w:p>
+        </w:tc>
+        <w:tc>
+          <w:tcPr>
+            <w:tcW w:w="5386" w:type="dxa"/>
+          </w:tcPr>
+          <w:p>
+            <w:pPr>
+              <w:spacing w:before="40" w:after="40"/>
+            </w:pPr>
+            <w:r>
+              <w:rPr>
+                <w:sz w:val="19"/>
+              </w:rPr>
+              <w:t>The system shall let each edition's identity and settings (the event name, the colours and visual identity, the logos, and the edition's start and end dates) be configured from the Control Panel, so a new edition is set up without a code change.</w:t>
             </w:r>
           </w:p>
         </w:tc>
@@ -10762,7 +11160,7 @@
         <w:pStyle w:val="Heading2"/>
         <w:spacing w:before="160" w:after="120"/>
       </w:pPr>
-      <w:bookmarkStart w:id="15" w:name="_Toc235478995"/>
+      <w:bookmarkStart w:id="15" w:name="_Toc235514824"/>
       <w:r>
         <w:rPr>
           <w:rFonts w:ascii="Arial" w:hAnsi="Arial"/>
@@ -11165,7 +11563,7 @@
               <w:rPr>
                 <w:sz w:val="21"/>
               </w:rPr>
-              <w:t>The system shall embed the live-broadcast stream and integrate a map and location service for the venue map and GPS presence.</w:t>
+              <w:t>The system shall embed the live-broadcast stream and integrate a map service for the interactive venue map.</w:t>
             </w:r>
           </w:p>
         </w:tc>
@@ -11252,7 +11650,7 @@
         <w:pStyle w:val="Heading2"/>
         <w:spacing w:before="160" w:after="120"/>
       </w:pPr>
-      <w:bookmarkStart w:id="16" w:name="_Toc235478996"/>
+      <w:bookmarkStart w:id="16" w:name="_Toc235514825"/>
       <w:r>
         <w:rPr>
           <w:rFonts w:ascii="Arial" w:hAnsi="Arial"/>
@@ -11466,7 +11864,7 @@
               <w:rPr>
                 <w:sz w:val="21"/>
               </w:rPr>
-              <w:t>Performance. The system shall sustain the load profile in the technical requirements: a new registered user roughly every 30 seconds, and a pre-launch traffic test under real load.</w:t>
+              <w:t>Performance. The system shall sustain the expected event load, sized at roughly one new registered user every 30 seconds at peak, and shall pass a realistic load test before launch.</w:t>
             </w:r>
           </w:p>
         </w:tc>
@@ -11579,7 +11977,7 @@
               <w:rPr>
                 <w:sz w:val="21"/>
               </w:rPr>
-              <w:t>Usability and accessibility. The mobile app shall provide the accessibility settings in the 41-screen scope. Colour shall never be the only signal of state. The interfaces shall be operable by keyboard where they run in a browser.</w:t>
+              <w:t>Usability and accessibility. The mobile app shall provide accessibility settings, including sign-language and live-caption support. Colour shall never be the only signal of state. The interfaces shall be operable by keyboard where they run in a browser.</w:t>
             </w:r>
           </w:p>
         </w:tc>
@@ -11742,7 +12140,7 @@
         <w:pStyle w:val="Heading2"/>
         <w:spacing w:before="160" w:after="120"/>
       </w:pPr>
-      <w:bookmarkStart w:id="17" w:name="_Toc235478997"/>
+      <w:bookmarkStart w:id="17" w:name="_Toc235514826"/>
       <w:r>
         <w:rPr>
           <w:rFonts w:ascii="Arial" w:hAnsi="Arial"/>
@@ -11841,7 +12239,7 @@
         <w:pStyle w:val="Heading2"/>
         <w:spacing w:before="160" w:after="120"/>
       </w:pPr>
-      <w:bookmarkStart w:id="18" w:name="_Toc235478998"/>
+      <w:bookmarkStart w:id="18" w:name="_Toc235514827"/>
       <w:r>
         <w:rPr>
           <w:rFonts w:ascii="Arial" w:hAnsi="Arial"/>
@@ -11904,7 +12302,7 @@
         <w:pStyle w:val="Heading2"/>
         <w:spacing w:before="160" w:after="120"/>
       </w:pPr>
-      <w:bookmarkStart w:id="19" w:name="_Toc235478999"/>
+      <w:bookmarkStart w:id="19" w:name="_Toc235514828"/>
       <w:r>
         <w:rPr>
           <w:rFonts w:ascii="Arial" w:hAnsi="Arial"/>
@@ -12109,7 +12507,7 @@
               <w:rPr>
                 <w:sz w:val="21"/>
               </w:rPr>
-              <w:t>FR-808, FR-901</w:t>
+              <w:t>FR-701, FR-808, FR-901</w:t>
             </w:r>
           </w:p>
         </w:tc>
@@ -12146,7 +12544,7 @@
               <w:rPr>
                 <w:sz w:val="21"/>
               </w:rPr>
-              <w:t>Confirm the venue boundary for the GPS geofence and the arrival-to-attendance chain.</w:t>
+              <w:t>Confirm the venue boundary for the GPS geofence (automatic arrival detection and movement tracking).</w:t>
             </w:r>
           </w:p>
         </w:tc>
@@ -12162,7 +12560,7 @@
               <w:rPr>
                 <w:sz w:val="21"/>
               </w:rPr>
-              <w:t>FR-305, FR-506, FR-704</w:t>
+              <w:t>FR-305, FR-1103</w:t>
             </w:r>
           </w:p>
         </w:tc>
@@ -12218,7 +12616,7 @@
               <w:rPr>
                 <w:sz w:val="21"/>
               </w:rPr>
-              <w:t>Control block</w:t>
+              <w:t>Cover page (document classification)</w:t>
             </w:r>
           </w:p>
         </w:tc>
@@ -12229,7 +12627,7 @@
         <w:pStyle w:val="Heading1"/>
         <w:spacing w:before="240" w:after="120"/>
       </w:pPr>
-      <w:bookmarkStart w:id="20" w:name="_Toc235479000"/>
+      <w:bookmarkStart w:id="20" w:name="_Toc235514829"/>
       <w:r>
         <w:rPr>
           <w:rFonts w:ascii="Arial" w:hAnsi="Arial"/>
@@ -12431,31 +12829,31 @@
       </w:rPr>
     </w:lvl>
   </w:abstractNum>
-  <w:num w:numId="1" w16cid:durableId="95486046">
+  <w:num w:numId="1" w16cid:durableId="1522353932">
     <w:abstractNumId w:val="8"/>
   </w:num>
-  <w:num w:numId="2" w16cid:durableId="151604089">
+  <w:num w:numId="2" w16cid:durableId="326977155">
     <w:abstractNumId w:val="6"/>
   </w:num>
-  <w:num w:numId="3" w16cid:durableId="1609773371">
+  <w:num w:numId="3" w16cid:durableId="1094931995">
     <w:abstractNumId w:val="5"/>
   </w:num>
-  <w:num w:numId="4" w16cid:durableId="1992445037">
+  <w:num w:numId="4" w16cid:durableId="1825705887">
     <w:abstractNumId w:val="4"/>
   </w:num>
-  <w:num w:numId="5" w16cid:durableId="332731473">
+  <w:num w:numId="5" w16cid:durableId="730735822">
     <w:abstractNumId w:val="7"/>
   </w:num>
-  <w:num w:numId="6" w16cid:durableId="1583836658">
+  <w:num w:numId="6" w16cid:durableId="1295411481">
     <w:abstractNumId w:val="3"/>
   </w:num>
-  <w:num w:numId="7" w16cid:durableId="1519931934">
+  <w:num w:numId="7" w16cid:durableId="1463617367">
     <w:abstractNumId w:val="2"/>
   </w:num>
-  <w:num w:numId="8" w16cid:durableId="366954460">
+  <w:num w:numId="8" w16cid:durableId="1622224835">
     <w:abstractNumId w:val="1"/>
   </w:num>
-  <w:num w:numId="9" w16cid:durableId="1068649116">
+  <w:num w:numId="9" w16cid:durableId="1561331089">
     <w:abstractNumId w:val="0"/>
   </w:num>
 </w:numbering>
@@ -23851,7 +24249,7 @@
     <w:autoRedefine/>
     <w:uiPriority w:val="39"/>
     <w:unhideWhenUsed/>
-    <w:rsid w:val="00FB3378"/>
+    <w:rsid w:val="00DB26F7"/>
     <w:pPr>
       <w:spacing w:after="100"/>
     </w:pPr>
@@ -23863,7 +24261,7 @@
     <w:autoRedefine/>
     <w:uiPriority w:val="39"/>
     <w:unhideWhenUsed/>
-    <w:rsid w:val="00FB3378"/>
+    <w:rsid w:val="00DB26F7"/>
     <w:pPr>
       <w:spacing w:after="100"/>
       <w:ind w:left="240"/>
@@ -23876,7 +24274,7 @@
     <w:autoRedefine/>
     <w:uiPriority w:val="39"/>
     <w:unhideWhenUsed/>
-    <w:rsid w:val="00FB3378"/>
+    <w:rsid w:val="00DB26F7"/>
     <w:pPr>
       <w:spacing w:after="100"/>
       <w:ind w:left="480"/>
@@ -23887,7 +24285,7 @@
     <w:basedOn w:val="DefaultParagraphFont"/>
     <w:uiPriority w:val="99"/>
     <w:unhideWhenUsed/>
-    <w:rsid w:val="00FB3378"/>
+    <w:rsid w:val="00DB26F7"/>
     <w:rPr>
       <w:color w:val="0000FF" w:themeColor="hyperlink"/>
       <w:u w:val="single"/>

</xml_diff>

<commit_message>
docs: make forum dates configuration-driven across governing docs
Replace the hardcoded/'immovable' 23-25 November 2026 wording with 'configuration data, set in the Control Panel' across Concept-Summary, PEP, Program-Plan, and SRS (full + brief). Expand the bugs & updates tracker with Topic 9 / item #40 (dynamic forum dates) and refresh the metrics (41 items, 5 done). Regenerate BRD-EN, HLD-002, and LLD-002 deliverables to match.

Co-Authored-By: Claude Opus 4.8 (1M context) <noreply@anthropic.com>
</commit_message>
<xml_diff>
--- a/docs/SIMF-BRD-001-Business-Requirements-Document-EN.docx
+++ b/docs/SIMF-BRD-001-Business-Requirements-Document-EN.docx
@@ -353,7 +353,13 @@
               <w:rPr>
                 <w:sz w:val="21"/>
               </w:rPr>
-              <w:t>19 July 2026</w:t>
+              <w:t>21</w:t>
+            </w:r>
+            <w:r>
+              <w:rPr>
+                <w:sz w:val="21"/>
+              </w:rPr>
+              <w:t xml:space="preserve"> July 2026</w:t>
             </w:r>
           </w:p>
         </w:tc>
@@ -655,6 +661,7 @@
           <w:color w:val="0D5341"/>
           <w:sz w:val="30"/>
         </w:rPr>
+        <w:lastRenderedPageBreak/>
         <w:t>Revision History</w:t>
       </w:r>
     </w:p>
@@ -987,6 +994,7 @@
           <w:color w:val="0D5341"/>
           <w:sz w:val="30"/>
         </w:rPr>
+        <w:lastRenderedPageBreak/>
         <w:t>Table of Contents</w:t>
       </w:r>
     </w:p>
@@ -2531,6 +2539,7 @@
           <w:color w:val="0D5341"/>
           <w:sz w:val="30"/>
         </w:rPr>
+        <w:lastRenderedPageBreak/>
         <w:t>Glossary and Abbreviations</w:t>
       </w:r>
     </w:p>
@@ -3786,6 +3795,7 @@
           <w:color w:val="0D5341"/>
           <w:sz w:val="30"/>
         </w:rPr>
+        <w:lastRenderedPageBreak/>
         <w:t>1. Introduction</w:t>
       </w:r>
       <w:bookmarkEnd w:id="0"/>
@@ -4220,13 +4230,11 @@
         <w:spacing w:after="120"/>
       </w:pPr>
       <w:r>
-        <w:t xml:space="preserve">The Saudi International Maritime Forum is a recurring event, and this is its fourth edition. Each previous edition ran on its own separately built systems, website and app, produced from scratch for that edition and then set aside. Rebuilding every time is costly and slow, scatters each edition's data in a different place, leaves no single reusable platform and no consolidated record across editions, and forces the cybersecurity controls, the technology choices and any intelligent features to be worked out </w:t>
+        <w:t xml:space="preserve">The Saudi International Maritime Forum is a recurring event, and this is its fourth edition. Each previous edition ran on its own separately built systems, website and app, produced from scratch for that edition and then set aside. Rebuilding every time is costly and slow, scatters each edition's data in a different place, leaves no single reusable platform and no consolidated record across editions, and forces the cybersecurity controls, the technology choices and any intelligent features to be worked out again from the ground up for every edition. What is needed is one dynamic, configurable system and app, built on modern technology, embedding AI and emerging technologies, and compliant with the National Cybersecurity Authority (NCA) standards, that can serve the current edition and every </w:t>
       </w:r>
       <w:r>
-        <w:t>again from the ground up for every edition. What is needed is one dynamic, configurable system and app, built on modern technology, embedding AI and emerging technologies, and compliant with the National Cybersecurity Authority (NCA) standards, that can serve the current edition and every future edition without being rebuilt, with all editions' data held in one central location. The requirements in this document are based on the material provided by the owner and a series of interviews with the owner's repr</w:t>
-      </w:r>
-      <w:r>
-        <w:t>esentatives.</w:t>
+        <w:lastRenderedPageBreak/>
+        <w:t>future edition without being rebuilt, with all editions' data held in one central location. The requirements in this document are based on the material provided by the owner and a series of interviews with the owner's representatives.</w:t>
       </w:r>
     </w:p>
     <w:p>
@@ -4249,10 +4257,7 @@
         <w:spacing w:after="120"/>
       </w:pPr>
       <w:r>
-        <w:t>Each edition of the forum has been delivered on its own bespoke systems, website and app, built specifically for that edition. Nothing carries over: the event identity, content, categories and dates are fixed per edition, each edition's data is stored separately, and a new build, with its own security posture and technology, is commissioned every time the forum is held. There is no single configurable platform, no centralised store spanning the editions, and no consistent, reusable base for cybersecurity co</w:t>
-      </w:r>
-      <w:r>
-        <w:t>mpliance or for AI-assisted features.</w:t>
+        <w:t>Each edition of the forum has been delivered on its own bespoke systems, website and app, built specifically for that edition. Nothing carries over: the event identity, content, categories and dates are fixed per edition, each edition's data is stored separately, and a new build, with its own security posture and technology, is commissioned every time the forum is held. There is no single configurable platform, no centralised store spanning the editions, and no consistent, reusable base for cybersecurity compliance or for AI-assisted features.</w:t>
       </w:r>
     </w:p>
     <w:p>
@@ -4275,13 +4280,7 @@
         <w:spacing w:after="120"/>
       </w:pPr>
       <w:r>
-        <w:t>Design one dynamic, reusable platform, a single backend and unified API serving the administrative Control Panel, the public website and the attendee mobile app, that can run any edition of the forum without code changes. Everything that varies between editions is configured from the Control Panel: the event name, the colours, the logos and visual identity, the content and data, the categories, the start and end dates, and the archiving of past editions. All editions' data is held in one central location, s</w:t>
-      </w:r>
-      <w:r>
-        <w:t>o the same system is valid for the current edition and every future edition. The platform is built on a modern technology stack, embeds AI and emerging technologies (a cognitive assistant and knowledge base, AI-generated session summaries, AI comment moderation, AI live translation and accessibility, and smart attendee and session recommendations), and is engineered to comply with the National Cybersecurity Authority (NCA) standards. On this dynamic base the platform covers the full event lifecycle: registr</w:t>
-      </w:r>
-      <w:r>
-        <w:t>ation, security vetting and approval, badge issue and access control, the programme, sessions and bookings, live streaming and engagement, networking between attendees, the exhibition and sponsors, media and news and archive, notifications and statistics, running on-premises as a single tenant.</w:t>
+        <w:t>Design one dynamic, reusable platform, a single backend and unified API serving the administrative Control Panel, the public website and the attendee mobile app, that can run any edition of the forum without code changes. Everything that varies between editions is configured from the Control Panel: the event name, the colours, the logos and visual identity, the content and data, the categories, the start and end dates, and the archiving of past editions. All editions' data is held in one central location, so the same system is valid for the current edition and every future edition. The platform is built on a modern technology stack, embeds AI and emerging technologies (a cognitive assistant and knowledge base, AI-generated session summaries, AI comment moderation, AI live translation and accessibility, and smart attendee and session recommendations), and is engineered to comply with the National Cybersecurity Authority (NCA) standards. On this dynamic base the platform covers the full event lifecycle: registration, security vetting and approval, badge issue and access control, the programme, sessions and bookings, live streaming and engagement, networking between attendees, the exhibition and sponsors, media and news and archive, notifications and statistics, running on-premises as a single tenant.</w:t>
       </w:r>
     </w:p>
     <w:p>
@@ -4380,6 +4379,7 @@
         <w:rPr>
           <w:sz w:val="23"/>
         </w:rPr>
+        <w:lastRenderedPageBreak/>
         <w:t>Enable live streaming and engagement (questions and comments) with accessibility and review controls.</w:t>
       </w:r>
     </w:p>
@@ -4679,6 +4679,7 @@
         <w:rPr>
           <w:sz w:val="23"/>
         </w:rPr>
+        <w:lastRenderedPageBreak/>
         <w:t>Bookings: an attendee registers to attend a session or, in halls with assigned seating, reserves a specific seat (with no time overlap); the reservation confirms immediately with no approval, a reserved seat is cancelled automatically 3 minutes before the session starts if the attendee has not checked in, and the attendee checks in and out of the session at the hall.</w:t>
       </w:r>
     </w:p>
@@ -4787,6 +4788,7 @@
         <w:rPr>
           <w:noProof/>
         </w:rPr>
+        <w:lastRenderedPageBreak/>
         <w:drawing>
           <wp:inline distT="0" distB="0" distL="0" distR="0" wp14:anchorId="342F4018" wp14:editId="13BAADFD">
             <wp:extent cx="5580000" cy="5296271"/>
@@ -4847,6 +4849,7 @@
         <w:rPr>
           <w:noProof/>
         </w:rPr>
+        <w:lastRenderedPageBreak/>
         <w:drawing>
           <wp:inline distT="0" distB="0" distL="0" distR="0" wp14:anchorId="7BB19182" wp14:editId="662816D2">
             <wp:extent cx="5580000" cy="5012542"/>
@@ -5454,6 +5457,7 @@
           <w:color w:val="0D5341"/>
           <w:sz w:val="30"/>
         </w:rPr>
+        <w:lastRenderedPageBreak/>
         <w:t>5. System Requirements</w:t>
       </w:r>
       <w:bookmarkEnd w:id="12"/>
@@ -6581,7 +6585,14 @@
               <w:rPr>
                 <w:sz w:val="19"/>
               </w:rPr>
-              <w:t>The system shall provide a password-reset flow by email verification code.</w:t>
+              <w:t xml:space="preserve">The system shall provide a password-reset flow by email </w:t>
+            </w:r>
+            <w:r>
+              <w:rPr>
+                <w:sz w:val="19"/>
+              </w:rPr>
+              <w:lastRenderedPageBreak/>
+              <w:t>verification code.</w:t>
             </w:r>
           </w:p>
         </w:tc>
@@ -7875,6 +7886,7 @@
                 <w:color w:val="0D5341"/>
                 <w:sz w:val="21"/>
               </w:rPr>
+              <w:lastRenderedPageBreak/>
               <w:t>F-04</w:t>
             </w:r>
           </w:p>
@@ -9471,7 +9483,7 @@
                 <w:b/>
                 <w:sz w:val="19"/>
               </w:rPr>
-              <w:t xml:space="preserve">FR-709</w:t>
+              <w:t>FR-709</w:t>
             </w:r>
           </w:p>
         </w:tc>
@@ -9487,7 +9499,7 @@
               <w:rPr>
                 <w:sz w:val="19"/>
               </w:rPr>
-              <w:t xml:space="preserve">The system shall provide a dynamic rating and feedback capability that lets an attendee submit a rating and written feedback. Four rating scopes are currently defined: the session, the day, the programme, and the app. The rating scopes are managed as dynamic content, and rating is offered to an attendee on the basis of attendance.</w:t>
+              <w:t>The system shall provide a dynamic rating and feedback capability that lets an attendee submit a rating and written feedback. Four rating scopes are currently defined: the session, the day, the programme, and the app. The rating scopes are managed as dynamic content, and rating is offered to an attendee on the basis of attendance.</w:t>
             </w:r>
           </w:p>
         </w:tc>
@@ -9524,7 +9536,7 @@
                 <w:b/>
                 <w:sz w:val="19"/>
               </w:rPr>
-              <w:t xml:space="preserve">FR-710</w:t>
+              <w:t>FR-710</w:t>
             </w:r>
           </w:p>
         </w:tc>
@@ -9540,7 +9552,7 @@
               <w:rPr>
                 <w:sz w:val="19"/>
               </w:rPr>
-              <w:t xml:space="preserve">The system may optionally notify users in the vicinity of the venue about live or upcoming sessions. This is an optional feature and is not a mandatory requirement.</w:t>
+              <w:t>The system may optionally notify users in the vicinity of the venue about live or upcoming sessions. This is an optional feature and is not a mandatory requirement.</w:t>
             </w:r>
           </w:p>
         </w:tc>
@@ -11501,6 +11513,7 @@
               <w:rPr>
                 <w:sz w:val="21"/>
               </w:rPr>
+              <w:lastRenderedPageBreak/>
               <w:t>OP-05</w:t>
             </w:r>
           </w:p>
@@ -12301,6 +12314,7 @@
         <w:rPr>
           <w:sz w:val="23"/>
         </w:rPr>
+        <w:lastRenderedPageBreak/>
         <w:t>The system must satisfy the National Cybersecurity Authority standards.</w:t>
       </w:r>
     </w:p>

</xml_diff>